<commit_message>
Docs: README and project report (sections 11/12) for phase 1
README: public pages, the new dashboard sections (helplines, nearby
help, Get ready checklist, SOS drill), POST /api/users/me/sos-drill,
sosDrillCompletedAt, the tests/ui suite, 196 backend tests.

Report: section 11 now lists what was run per phase 1 item (UI suite
105/105, mvnw verify 196/196) and states that the earlier 231-check
UI suite is gone; section 12 lists what is still unverified.

Co-Authored-By: Claude Opus 5.5 <noreply@anthropic.com>
</commit_message>
<xml_diff>
--- a/SafeHer_Project_Report.docx
+++ b/SafeHer_Project_Report.docx
@@ -163,7 +163,7 @@
     <w:sdt>
       <w:sdtPr>
         <w:alias w:val="Contents"/>
-        <w:id w:val="-863741790"/>
+        <w:id w:val="-2069403021"/>
       </w:sdtPr>
       <w:sdtEndPr/>
       <w:sdtContent>
@@ -192,7 +192,7 @@
           <w:r>
             <w:fldChar w:fldCharType="separate"/>
           </w:r>
-          <w:hyperlink w:anchor="_Toc243772805" w:history="1">
+          <w:hyperlink w:anchor="_Toc243775094" w:history="1">
             <w:r>
               <w:rPr>
                 <w:rStyle w:val="Hyperlink"/>
@@ -216,7 +216,7 @@
               <w:rPr>
                 <w:noProof/>
               </w:rPr>
-              <w:instrText xml:space="preserve"> PAGEREF _Toc243772805 \h </w:instrText>
+              <w:instrText xml:space="preserve"> PAGEREF _Toc243775094 \h </w:instrText>
             </w:r>
             <w:r>
               <w:rPr>
@@ -259,7 +259,7 @@
               <w14:ligatures w14:val="standardContextual"/>
             </w:rPr>
           </w:pPr>
-          <w:hyperlink w:anchor="_Toc243772806" w:history="1">
+          <w:hyperlink w:anchor="_Toc243775095" w:history="1">
             <w:r>
               <w:rPr>
                 <w:rStyle w:val="Hyperlink"/>
@@ -283,7 +283,7 @@
               <w:rPr>
                 <w:noProof/>
               </w:rPr>
-              <w:instrText xml:space="preserve"> PAGEREF _Toc243772806 \h </w:instrText>
+              <w:instrText xml:space="preserve"> PAGEREF _Toc243775095 \h </w:instrText>
             </w:r>
             <w:r>
               <w:rPr>
@@ -326,7 +326,7 @@
               <w14:ligatures w14:val="standardContextual"/>
             </w:rPr>
           </w:pPr>
-          <w:hyperlink w:anchor="_Toc243772807" w:history="1">
+          <w:hyperlink w:anchor="_Toc243775096" w:history="1">
             <w:r>
               <w:rPr>
                 <w:rStyle w:val="Hyperlink"/>
@@ -350,7 +350,7 @@
               <w:rPr>
                 <w:noProof/>
               </w:rPr>
-              <w:instrText xml:space="preserve"> PAGEREF _Toc243772807 \h </w:instrText>
+              <w:instrText xml:space="preserve"> PAGEREF _Toc243775096 \h </w:instrText>
             </w:r>
             <w:r>
               <w:rPr>
@@ -393,7 +393,7 @@
               <w14:ligatures w14:val="standardContextual"/>
             </w:rPr>
           </w:pPr>
-          <w:hyperlink w:anchor="_Toc243772808" w:history="1">
+          <w:hyperlink w:anchor="_Toc243775097" w:history="1">
             <w:r>
               <w:rPr>
                 <w:rStyle w:val="Hyperlink"/>
@@ -417,7 +417,7 @@
               <w:rPr>
                 <w:noProof/>
               </w:rPr>
-              <w:instrText xml:space="preserve"> PAGEREF _Toc243772808 \h </w:instrText>
+              <w:instrText xml:space="preserve"> PAGEREF _Toc243775097 \h </w:instrText>
             </w:r>
             <w:r>
               <w:rPr>
@@ -460,7 +460,7 @@
               <w14:ligatures w14:val="standardContextual"/>
             </w:rPr>
           </w:pPr>
-          <w:hyperlink w:anchor="_Toc243772809" w:history="1">
+          <w:hyperlink w:anchor="_Toc243775098" w:history="1">
             <w:r>
               <w:rPr>
                 <w:rStyle w:val="Hyperlink"/>
@@ -484,7 +484,7 @@
               <w:rPr>
                 <w:noProof/>
               </w:rPr>
-              <w:instrText xml:space="preserve"> PAGEREF _Toc243772809 \h </w:instrText>
+              <w:instrText xml:space="preserve"> PAGEREF _Toc243775098 \h </w:instrText>
             </w:r>
             <w:r>
               <w:rPr>
@@ -527,7 +527,7 @@
               <w14:ligatures w14:val="standardContextual"/>
             </w:rPr>
           </w:pPr>
-          <w:hyperlink w:anchor="_Toc243772810" w:history="1">
+          <w:hyperlink w:anchor="_Toc243775099" w:history="1">
             <w:r>
               <w:rPr>
                 <w:rStyle w:val="Hyperlink"/>
@@ -551,7 +551,7 @@
               <w:rPr>
                 <w:noProof/>
               </w:rPr>
-              <w:instrText xml:space="preserve"> PAGEREF _Toc243772810 \h </w:instrText>
+              <w:instrText xml:space="preserve"> PAGEREF _Toc243775099 \h </w:instrText>
             </w:r>
             <w:r>
               <w:rPr>
@@ -594,7 +594,7 @@
               <w14:ligatures w14:val="standardContextual"/>
             </w:rPr>
           </w:pPr>
-          <w:hyperlink w:anchor="_Toc243772811" w:history="1">
+          <w:hyperlink w:anchor="_Toc243775100" w:history="1">
             <w:r>
               <w:rPr>
                 <w:rStyle w:val="Hyperlink"/>
@@ -618,7 +618,7 @@
               <w:rPr>
                 <w:noProof/>
               </w:rPr>
-              <w:instrText xml:space="preserve"> PAGEREF _Toc243772811 \h </w:instrText>
+              <w:instrText xml:space="preserve"> PAGEREF _Toc243775100 \h </w:instrText>
             </w:r>
             <w:r>
               <w:rPr>
@@ -661,7 +661,7 @@
               <w14:ligatures w14:val="standardContextual"/>
             </w:rPr>
           </w:pPr>
-          <w:hyperlink w:anchor="_Toc243772812" w:history="1">
+          <w:hyperlink w:anchor="_Toc243775101" w:history="1">
             <w:r>
               <w:rPr>
                 <w:rStyle w:val="Hyperlink"/>
@@ -685,7 +685,7 @@
               <w:rPr>
                 <w:noProof/>
               </w:rPr>
-              <w:instrText xml:space="preserve"> PAGEREF _Toc243772812 \h </w:instrText>
+              <w:instrText xml:space="preserve"> PAGEREF _Toc243775101 \h </w:instrText>
             </w:r>
             <w:r>
               <w:rPr>
@@ -728,7 +728,7 @@
               <w14:ligatures w14:val="standardContextual"/>
             </w:rPr>
           </w:pPr>
-          <w:hyperlink w:anchor="_Toc243772813" w:history="1">
+          <w:hyperlink w:anchor="_Toc243775102" w:history="1">
             <w:r>
               <w:rPr>
                 <w:rStyle w:val="Hyperlink"/>
@@ -752,7 +752,7 @@
               <w:rPr>
                 <w:noProof/>
               </w:rPr>
-              <w:instrText xml:space="preserve"> PAGEREF _Toc243772813 \h </w:instrText>
+              <w:instrText xml:space="preserve"> PAGEREF _Toc243775102 \h </w:instrText>
             </w:r>
             <w:r>
               <w:rPr>
@@ -795,7 +795,7 @@
               <w14:ligatures w14:val="standardContextual"/>
             </w:rPr>
           </w:pPr>
-          <w:hyperlink w:anchor="_Toc243772814" w:history="1">
+          <w:hyperlink w:anchor="_Toc243775103" w:history="1">
             <w:r>
               <w:rPr>
                 <w:rStyle w:val="Hyperlink"/>
@@ -819,7 +819,7 @@
               <w:rPr>
                 <w:noProof/>
               </w:rPr>
-              <w:instrText xml:space="preserve"> PAGEREF _Toc243772814 \h </w:instrText>
+              <w:instrText xml:space="preserve"> PAGEREF _Toc243775103 \h </w:instrText>
             </w:r>
             <w:r>
               <w:rPr>
@@ -862,7 +862,7 @@
               <w14:ligatures w14:val="standardContextual"/>
             </w:rPr>
           </w:pPr>
-          <w:hyperlink w:anchor="_Toc243772815" w:history="1">
+          <w:hyperlink w:anchor="_Toc243775104" w:history="1">
             <w:r>
               <w:rPr>
                 <w:rStyle w:val="Hyperlink"/>
@@ -886,7 +886,7 @@
               <w:rPr>
                 <w:noProof/>
               </w:rPr>
-              <w:instrText xml:space="preserve"> PAGEREF _Toc243772815 \h </w:instrText>
+              <w:instrText xml:space="preserve"> PAGEREF _Toc243775104 \h </w:instrText>
             </w:r>
             <w:r>
               <w:rPr>
@@ -929,7 +929,7 @@
               <w14:ligatures w14:val="standardContextual"/>
             </w:rPr>
           </w:pPr>
-          <w:hyperlink w:anchor="_Toc243772816" w:history="1">
+          <w:hyperlink w:anchor="_Toc243775105" w:history="1">
             <w:r>
               <w:rPr>
                 <w:rStyle w:val="Hyperlink"/>
@@ -953,7 +953,7 @@
               <w:rPr>
                 <w:noProof/>
               </w:rPr>
-              <w:instrText xml:space="preserve"> PAGEREF _Toc243772816 \h </w:instrText>
+              <w:instrText xml:space="preserve"> PAGEREF _Toc243775105 \h </w:instrText>
             </w:r>
             <w:r>
               <w:rPr>
@@ -996,7 +996,7 @@
               <w14:ligatures w14:val="standardContextual"/>
             </w:rPr>
           </w:pPr>
-          <w:hyperlink w:anchor="_Toc243772817" w:history="1">
+          <w:hyperlink w:anchor="_Toc243775106" w:history="1">
             <w:r>
               <w:rPr>
                 <w:rStyle w:val="Hyperlink"/>
@@ -1020,7 +1020,7 @@
               <w:rPr>
                 <w:noProof/>
               </w:rPr>
-              <w:instrText xml:space="preserve"> PAGEREF _Toc243772817 \h </w:instrText>
+              <w:instrText xml:space="preserve"> PAGEREF _Toc243775106 \h </w:instrText>
             </w:r>
             <w:r>
               <w:rPr>
@@ -1063,7 +1063,7 @@
               <w14:ligatures w14:val="standardContextual"/>
             </w:rPr>
           </w:pPr>
-          <w:hyperlink w:anchor="_Toc243772818" w:history="1">
+          <w:hyperlink w:anchor="_Toc243775107" w:history="1">
             <w:r>
               <w:rPr>
                 <w:rStyle w:val="Hyperlink"/>
@@ -1087,7 +1087,7 @@
               <w:rPr>
                 <w:noProof/>
               </w:rPr>
-              <w:instrText xml:space="preserve"> PAGEREF _Toc243772818 \h </w:instrText>
+              <w:instrText xml:space="preserve"> PAGEREF _Toc243775107 \h </w:instrText>
             </w:r>
             <w:r>
               <w:rPr>
@@ -1130,7 +1130,7 @@
               <w14:ligatures w14:val="standardContextual"/>
             </w:rPr>
           </w:pPr>
-          <w:hyperlink w:anchor="_Toc243772819" w:history="1">
+          <w:hyperlink w:anchor="_Toc243775108" w:history="1">
             <w:r>
               <w:rPr>
                 <w:rStyle w:val="Hyperlink"/>
@@ -1154,7 +1154,7 @@
               <w:rPr>
                 <w:noProof/>
               </w:rPr>
-              <w:instrText xml:space="preserve"> PAGEREF _Toc243772819 \h </w:instrText>
+              <w:instrText xml:space="preserve"> PAGEREF _Toc243775108 \h </w:instrText>
             </w:r>
             <w:r>
               <w:rPr>
@@ -1197,7 +1197,7 @@
               <w14:ligatures w14:val="standardContextual"/>
             </w:rPr>
           </w:pPr>
-          <w:hyperlink w:anchor="_Toc243772820" w:history="1">
+          <w:hyperlink w:anchor="_Toc243775109" w:history="1">
             <w:r>
               <w:rPr>
                 <w:rStyle w:val="Hyperlink"/>
@@ -1221,7 +1221,7 @@
               <w:rPr>
                 <w:noProof/>
               </w:rPr>
-              <w:instrText xml:space="preserve"> PAGEREF _Toc243772820 \h </w:instrText>
+              <w:instrText xml:space="preserve"> PAGEREF _Toc243775109 \h </w:instrText>
             </w:r>
             <w:r>
               <w:rPr>
@@ -1264,7 +1264,7 @@
               <w14:ligatures w14:val="standardContextual"/>
             </w:rPr>
           </w:pPr>
-          <w:hyperlink w:anchor="_Toc243772821" w:history="1">
+          <w:hyperlink w:anchor="_Toc243775110" w:history="1">
             <w:r>
               <w:rPr>
                 <w:rStyle w:val="Hyperlink"/>
@@ -1288,7 +1288,7 @@
               <w:rPr>
                 <w:noProof/>
               </w:rPr>
-              <w:instrText xml:space="preserve"> PAGEREF _Toc243772821 \h </w:instrText>
+              <w:instrText xml:space="preserve"> PAGEREF _Toc243775110 \h </w:instrText>
             </w:r>
             <w:r>
               <w:rPr>
@@ -1331,7 +1331,7 @@
               <w14:ligatures w14:val="standardContextual"/>
             </w:rPr>
           </w:pPr>
-          <w:hyperlink w:anchor="_Toc243772822" w:history="1">
+          <w:hyperlink w:anchor="_Toc243775111" w:history="1">
             <w:r>
               <w:rPr>
                 <w:rStyle w:val="Hyperlink"/>
@@ -1355,7 +1355,7 @@
               <w:rPr>
                 <w:noProof/>
               </w:rPr>
-              <w:instrText xml:space="preserve"> PAGEREF _Toc243772822 \h </w:instrText>
+              <w:instrText xml:space="preserve"> PAGEREF _Toc243775111 \h </w:instrText>
             </w:r>
             <w:r>
               <w:rPr>
@@ -1398,7 +1398,7 @@
               <w14:ligatures w14:val="standardContextual"/>
             </w:rPr>
           </w:pPr>
-          <w:hyperlink w:anchor="_Toc243772823" w:history="1">
+          <w:hyperlink w:anchor="_Toc243775112" w:history="1">
             <w:r>
               <w:rPr>
                 <w:rStyle w:val="Hyperlink"/>
@@ -1422,7 +1422,7 @@
               <w:rPr>
                 <w:noProof/>
               </w:rPr>
-              <w:instrText xml:space="preserve"> PAGEREF _Toc243772823 \h </w:instrText>
+              <w:instrText xml:space="preserve"> PAGEREF _Toc243775112 \h </w:instrText>
             </w:r>
             <w:r>
               <w:rPr>
@@ -1465,7 +1465,7 @@
               <w14:ligatures w14:val="standardContextual"/>
             </w:rPr>
           </w:pPr>
-          <w:hyperlink w:anchor="_Toc243772824" w:history="1">
+          <w:hyperlink w:anchor="_Toc243775113" w:history="1">
             <w:r>
               <w:rPr>
                 <w:rStyle w:val="Hyperlink"/>
@@ -1489,7 +1489,7 @@
               <w:rPr>
                 <w:noProof/>
               </w:rPr>
-              <w:instrText xml:space="preserve"> PAGEREF _Toc243772824 \h </w:instrText>
+              <w:instrText xml:space="preserve"> PAGEREF _Toc243775113 \h </w:instrText>
             </w:r>
             <w:r>
               <w:rPr>
@@ -1532,7 +1532,7 @@
               <w14:ligatures w14:val="standardContextual"/>
             </w:rPr>
           </w:pPr>
-          <w:hyperlink w:anchor="_Toc243772825" w:history="1">
+          <w:hyperlink w:anchor="_Toc243775114" w:history="1">
             <w:r>
               <w:rPr>
                 <w:rStyle w:val="Hyperlink"/>
@@ -1556,7 +1556,7 @@
               <w:rPr>
                 <w:noProof/>
               </w:rPr>
-              <w:instrText xml:space="preserve"> PAGEREF _Toc243772825 \h </w:instrText>
+              <w:instrText xml:space="preserve"> PAGEREF _Toc243775114 \h </w:instrText>
             </w:r>
             <w:r>
               <w:rPr>
@@ -1599,7 +1599,7 @@
               <w14:ligatures w14:val="standardContextual"/>
             </w:rPr>
           </w:pPr>
-          <w:hyperlink w:anchor="_Toc243772826" w:history="1">
+          <w:hyperlink w:anchor="_Toc243775115" w:history="1">
             <w:r>
               <w:rPr>
                 <w:rStyle w:val="Hyperlink"/>
@@ -1623,7 +1623,7 @@
               <w:rPr>
                 <w:noProof/>
               </w:rPr>
-              <w:instrText xml:space="preserve"> PAGEREF _Toc243772826 \h </w:instrText>
+              <w:instrText xml:space="preserve"> PAGEREF _Toc243775115 \h </w:instrText>
             </w:r>
             <w:r>
               <w:rPr>
@@ -1666,7 +1666,7 @@
               <w14:ligatures w14:val="standardContextual"/>
             </w:rPr>
           </w:pPr>
-          <w:hyperlink w:anchor="_Toc243772827" w:history="1">
+          <w:hyperlink w:anchor="_Toc243775116" w:history="1">
             <w:r>
               <w:rPr>
                 <w:rStyle w:val="Hyperlink"/>
@@ -1690,7 +1690,7 @@
               <w:rPr>
                 <w:noProof/>
               </w:rPr>
-              <w:instrText xml:space="preserve"> PAGEREF _Toc243772827 \h </w:instrText>
+              <w:instrText xml:space="preserve"> PAGEREF _Toc243775116 \h </w:instrText>
             </w:r>
             <w:r>
               <w:rPr>
@@ -1733,7 +1733,7 @@
               <w14:ligatures w14:val="standardContextual"/>
             </w:rPr>
           </w:pPr>
-          <w:hyperlink w:anchor="_Toc243772828" w:history="1">
+          <w:hyperlink w:anchor="_Toc243775117" w:history="1">
             <w:r>
               <w:rPr>
                 <w:rStyle w:val="Hyperlink"/>
@@ -1757,7 +1757,7 @@
               <w:rPr>
                 <w:noProof/>
               </w:rPr>
-              <w:instrText xml:space="preserve"> PAGEREF _Toc243772828 \h </w:instrText>
+              <w:instrText xml:space="preserve"> PAGEREF _Toc243775117 \h </w:instrText>
             </w:r>
             <w:r>
               <w:rPr>
@@ -1800,7 +1800,7 @@
               <w14:ligatures w14:val="standardContextual"/>
             </w:rPr>
           </w:pPr>
-          <w:hyperlink w:anchor="_Toc243772829" w:history="1">
+          <w:hyperlink w:anchor="_Toc243775118" w:history="1">
             <w:r>
               <w:rPr>
                 <w:rStyle w:val="Hyperlink"/>
@@ -1824,7 +1824,7 @@
               <w:rPr>
                 <w:noProof/>
               </w:rPr>
-              <w:instrText xml:space="preserve"> PAGEREF _Toc243772829 \h </w:instrText>
+              <w:instrText xml:space="preserve"> PAGEREF _Toc243775118 \h </w:instrText>
             </w:r>
             <w:r>
               <w:rPr>
@@ -1867,7 +1867,7 @@
               <w14:ligatures w14:val="standardContextual"/>
             </w:rPr>
           </w:pPr>
-          <w:hyperlink w:anchor="_Toc243772830" w:history="1">
+          <w:hyperlink w:anchor="_Toc243775119" w:history="1">
             <w:r>
               <w:rPr>
                 <w:rStyle w:val="Hyperlink"/>
@@ -1891,7 +1891,7 @@
               <w:rPr>
                 <w:noProof/>
               </w:rPr>
-              <w:instrText xml:space="preserve"> PAGEREF _Toc243772830 \h </w:instrText>
+              <w:instrText xml:space="preserve"> PAGEREF _Toc243775119 \h </w:instrText>
             </w:r>
             <w:r>
               <w:rPr>
@@ -1934,7 +1934,7 @@
               <w14:ligatures w14:val="standardContextual"/>
             </w:rPr>
           </w:pPr>
-          <w:hyperlink w:anchor="_Toc243772831" w:history="1">
+          <w:hyperlink w:anchor="_Toc243775120" w:history="1">
             <w:r>
               <w:rPr>
                 <w:rStyle w:val="Hyperlink"/>
@@ -1958,7 +1958,7 @@
               <w:rPr>
                 <w:noProof/>
               </w:rPr>
-              <w:instrText xml:space="preserve"> PAGEREF _Toc243772831 \h </w:instrText>
+              <w:instrText xml:space="preserve"> PAGEREF _Toc243775120 \h </w:instrText>
             </w:r>
             <w:r>
               <w:rPr>
@@ -2001,7 +2001,7 @@
               <w14:ligatures w14:val="standardContextual"/>
             </w:rPr>
           </w:pPr>
-          <w:hyperlink w:anchor="_Toc243772832" w:history="1">
+          <w:hyperlink w:anchor="_Toc243775121" w:history="1">
             <w:r>
               <w:rPr>
                 <w:rStyle w:val="Hyperlink"/>
@@ -2025,7 +2025,7 @@
               <w:rPr>
                 <w:noProof/>
               </w:rPr>
-              <w:instrText xml:space="preserve"> PAGEREF _Toc243772832 \h </w:instrText>
+              <w:instrText xml:space="preserve"> PAGEREF _Toc243775121 \h </w:instrText>
             </w:r>
             <w:r>
               <w:rPr>
@@ -2068,7 +2068,7 @@
               <w14:ligatures w14:val="standardContextual"/>
             </w:rPr>
           </w:pPr>
-          <w:hyperlink w:anchor="_Toc243772833" w:history="1">
+          <w:hyperlink w:anchor="_Toc243775122" w:history="1">
             <w:r>
               <w:rPr>
                 <w:rStyle w:val="Hyperlink"/>
@@ -2092,7 +2092,7 @@
               <w:rPr>
                 <w:noProof/>
               </w:rPr>
-              <w:instrText xml:space="preserve"> PAGEREF _Toc243772833 \h </w:instrText>
+              <w:instrText xml:space="preserve"> PAGEREF _Toc243775122 \h </w:instrText>
             </w:r>
             <w:r>
               <w:rPr>
@@ -2135,7 +2135,7 @@
               <w14:ligatures w14:val="standardContextual"/>
             </w:rPr>
           </w:pPr>
-          <w:hyperlink w:anchor="_Toc243772834" w:history="1">
+          <w:hyperlink w:anchor="_Toc243775123" w:history="1">
             <w:r>
               <w:rPr>
                 <w:rStyle w:val="Hyperlink"/>
@@ -2159,7 +2159,7 @@
               <w:rPr>
                 <w:noProof/>
               </w:rPr>
-              <w:instrText xml:space="preserve"> PAGEREF _Toc243772834 \h </w:instrText>
+              <w:instrText xml:space="preserve"> PAGEREF _Toc243775123 \h </w:instrText>
             </w:r>
             <w:r>
               <w:rPr>
@@ -2202,7 +2202,7 @@
               <w14:ligatures w14:val="standardContextual"/>
             </w:rPr>
           </w:pPr>
-          <w:hyperlink w:anchor="_Toc243772835" w:history="1">
+          <w:hyperlink w:anchor="_Toc243775124" w:history="1">
             <w:r>
               <w:rPr>
                 <w:rStyle w:val="Hyperlink"/>
@@ -2226,7 +2226,7 @@
               <w:rPr>
                 <w:noProof/>
               </w:rPr>
-              <w:instrText xml:space="preserve"> PAGEREF _Toc243772835 \h </w:instrText>
+              <w:instrText xml:space="preserve"> PAGEREF _Toc243775124 \h </w:instrText>
             </w:r>
             <w:r>
               <w:rPr>
@@ -2269,7 +2269,7 @@
               <w14:ligatures w14:val="standardContextual"/>
             </w:rPr>
           </w:pPr>
-          <w:hyperlink w:anchor="_Toc243772836" w:history="1">
+          <w:hyperlink w:anchor="_Toc243775125" w:history="1">
             <w:r>
               <w:rPr>
                 <w:rStyle w:val="Hyperlink"/>
@@ -2293,7 +2293,7 @@
               <w:rPr>
                 <w:noProof/>
               </w:rPr>
-              <w:instrText xml:space="preserve"> PAGEREF _Toc243772836 \h </w:instrText>
+              <w:instrText xml:space="preserve"> PAGEREF _Toc243775125 \h </w:instrText>
             </w:r>
             <w:r>
               <w:rPr>
@@ -2336,7 +2336,7 @@
               <w14:ligatures w14:val="standardContextual"/>
             </w:rPr>
           </w:pPr>
-          <w:hyperlink w:anchor="_Toc243772837" w:history="1">
+          <w:hyperlink w:anchor="_Toc243775126" w:history="1">
             <w:r>
               <w:rPr>
                 <w:rStyle w:val="Hyperlink"/>
@@ -2360,7 +2360,7 @@
               <w:rPr>
                 <w:noProof/>
               </w:rPr>
-              <w:instrText xml:space="preserve"> PAGEREF _Toc243772837 \h </w:instrText>
+              <w:instrText xml:space="preserve"> PAGEREF _Toc243775126 \h </w:instrText>
             </w:r>
             <w:r>
               <w:rPr>
@@ -2403,7 +2403,7 @@
               <w14:ligatures w14:val="standardContextual"/>
             </w:rPr>
           </w:pPr>
-          <w:hyperlink w:anchor="_Toc243772838" w:history="1">
+          <w:hyperlink w:anchor="_Toc243775127" w:history="1">
             <w:r>
               <w:rPr>
                 <w:rStyle w:val="Hyperlink"/>
@@ -2427,7 +2427,7 @@
               <w:rPr>
                 <w:noProof/>
               </w:rPr>
-              <w:instrText xml:space="preserve"> PAGEREF _Toc243772838 \h </w:instrText>
+              <w:instrText xml:space="preserve"> PAGEREF _Toc243775127 \h </w:instrText>
             </w:r>
             <w:r>
               <w:rPr>
@@ -2470,7 +2470,7 @@
               <w14:ligatures w14:val="standardContextual"/>
             </w:rPr>
           </w:pPr>
-          <w:hyperlink w:anchor="_Toc243772839" w:history="1">
+          <w:hyperlink w:anchor="_Toc243775128" w:history="1">
             <w:r>
               <w:rPr>
                 <w:rStyle w:val="Hyperlink"/>
@@ -2494,7 +2494,7 @@
               <w:rPr>
                 <w:noProof/>
               </w:rPr>
-              <w:instrText xml:space="preserve"> PAGEREF _Toc243772839 \h </w:instrText>
+              <w:instrText xml:space="preserve"> PAGEREF _Toc243775128 \h </w:instrText>
             </w:r>
             <w:r>
               <w:rPr>
@@ -2537,13 +2537,13 @@
               <w14:ligatures w14:val="standardContextual"/>
             </w:rPr>
           </w:pPr>
-          <w:hyperlink w:anchor="_Toc243772840" w:history="1">
+          <w:hyperlink w:anchor="_Toc243775129" w:history="1">
             <w:r>
               <w:rPr>
                 <w:rStyle w:val="Hyperlink"/>
                 <w:noProof/>
               </w:rPr>
-              <w:t>11.4 Changes made after the last test runs (not yet tested)</w:t>
+              <w:t>11.4 Changed without a dedicated test</w:t>
             </w:r>
             <w:r>
               <w:rPr>
@@ -2561,7 +2561,7 @@
               <w:rPr>
                 <w:noProof/>
               </w:rPr>
-              <w:instrText xml:space="preserve"> PAGEREF _Toc243772840 \h </w:instrText>
+              <w:instrText xml:space="preserve"> PAGEREF _Toc243775129 \h </w:instrText>
             </w:r>
             <w:r>
               <w:rPr>
@@ -2578,7 +2578,74 @@
               <w:rPr>
                 <w:noProof/>
               </w:rPr>
-              <w:t>22</w:t>
+              <w:t>23</w:t>
+            </w:r>
+            <w:r>
+              <w:rPr>
+                <w:noProof/>
+              </w:rPr>
+              <w:fldChar w:fldCharType="end"/>
+            </w:r>
+          </w:hyperlink>
+        </w:p>
+        <w:p>
+          <w:pPr>
+            <w:pStyle w:val="TOC2"/>
+            <w:tabs>
+              <w:tab w:val="right" w:leader="dot" w:pos="9628"/>
+            </w:tabs>
+            <w:rPr>
+              <w:rFonts w:asciiTheme="minorHAnsi" w:eastAsiaTheme="minorEastAsia" w:hAnsiTheme="minorHAnsi" w:cstheme="minorBidi"/>
+              <w:noProof/>
+              <w:color w:val="auto"/>
+              <w:kern w:val="2"/>
+              <w:sz w:val="24"/>
+              <w:szCs w:val="24"/>
+              <w14:ligatures w14:val="standardContextual"/>
+            </w:rPr>
+          </w:pPr>
+          <w:hyperlink w:anchor="_Toc243775130" w:history="1">
+            <w:r>
+              <w:rPr>
+                <w:rStyle w:val="Hyperlink"/>
+                <w:noProof/>
+              </w:rPr>
+              <w:t>11.5 Phase 1 pages (24 Oct 2026) — what was run per item</w:t>
+            </w:r>
+            <w:r>
+              <w:rPr>
+                <w:noProof/>
+              </w:rPr>
+              <w:tab/>
+            </w:r>
+            <w:r>
+              <w:rPr>
+                <w:noProof/>
+              </w:rPr>
+              <w:fldChar w:fldCharType="begin"/>
+            </w:r>
+            <w:r>
+              <w:rPr>
+                <w:noProof/>
+              </w:rPr>
+              <w:instrText xml:space="preserve"> PAGEREF _Toc243775130 \h </w:instrText>
+            </w:r>
+            <w:r>
+              <w:rPr>
+                <w:noProof/>
+              </w:rPr>
+            </w:r>
+            <w:r>
+              <w:rPr>
+                <w:noProof/>
+              </w:rPr>
+              <w:fldChar w:fldCharType="separate"/>
+            </w:r>
+            <w:r>
+              <w:rPr>
+                <w:noProof/>
+              </w:rPr>
+              <w:t>23</w:t>
             </w:r>
             <w:r>
               <w:rPr>
@@ -2604,7 +2671,7 @@
               <w14:ligatures w14:val="standardContextual"/>
             </w:rPr>
           </w:pPr>
-          <w:hyperlink w:anchor="_Toc243772841" w:history="1">
+          <w:hyperlink w:anchor="_Toc243775131" w:history="1">
             <w:r>
               <w:rPr>
                 <w:rStyle w:val="Hyperlink"/>
@@ -2628,7 +2695,7 @@
               <w:rPr>
                 <w:noProof/>
               </w:rPr>
-              <w:instrText xml:space="preserve"> PAGEREF _Toc243772841 \h </w:instrText>
+              <w:instrText xml:space="preserve"> PAGEREF _Toc243775131 \h </w:instrText>
             </w:r>
             <w:r>
               <w:rPr>
@@ -2671,7 +2738,7 @@
               <w14:ligatures w14:val="standardContextual"/>
             </w:rPr>
           </w:pPr>
-          <w:hyperlink w:anchor="_Toc243772842" w:history="1">
+          <w:hyperlink w:anchor="_Toc243775132" w:history="1">
             <w:r>
               <w:rPr>
                 <w:rStyle w:val="Hyperlink"/>
@@ -2695,7 +2762,7 @@
               <w:rPr>
                 <w:noProof/>
               </w:rPr>
-              <w:instrText xml:space="preserve"> PAGEREF _Toc243772842 \h </w:instrText>
+              <w:instrText xml:space="preserve"> PAGEREF _Toc243775132 \h </w:instrText>
             </w:r>
             <w:r>
               <w:rPr>
@@ -2738,13 +2805,13 @@
               <w14:ligatures w14:val="standardContextual"/>
             </w:rPr>
           </w:pPr>
-          <w:hyperlink w:anchor="_Toc243772843" w:history="1">
+          <w:hyperlink w:anchor="_Toc243775133" w:history="1">
             <w:r>
               <w:rPr>
                 <w:rStyle w:val="Hyperlink"/>
                 <w:noProof/>
               </w:rPr>
-              <w:t>12.2 Not done / needs external setup</w:t>
+              <w:t>12.2 Phase 1: still unverified</w:t>
             </w:r>
             <w:r>
               <w:rPr>
@@ -2762,7 +2829,7 @@
               <w:rPr>
                 <w:noProof/>
               </w:rPr>
-              <w:instrText xml:space="preserve"> PAGEREF _Toc243772843 \h </w:instrText>
+              <w:instrText xml:space="preserve"> PAGEREF _Toc243775133 \h </w:instrText>
             </w:r>
             <w:r>
               <w:rPr>
@@ -2805,13 +2872,13 @@
               <w14:ligatures w14:val="standardContextual"/>
             </w:rPr>
           </w:pPr>
-          <w:hyperlink w:anchor="_Toc243772844" w:history="1">
+          <w:hyperlink w:anchor="_Toc243775134" w:history="1">
             <w:r>
               <w:rPr>
                 <w:rStyle w:val="Hyperlink"/>
                 <w:noProof/>
               </w:rPr>
-              <w:t>12.3 Known limitations</w:t>
+              <w:t>12.3 Not done / needs external setup</w:t>
             </w:r>
             <w:r>
               <w:rPr>
@@ -2829,7 +2896,7 @@
               <w:rPr>
                 <w:noProof/>
               </w:rPr>
-              <w:instrText xml:space="preserve"> PAGEREF _Toc243772844 \h </w:instrText>
+              <w:instrText xml:space="preserve"> PAGEREF _Toc243775134 \h </w:instrText>
             </w:r>
             <w:r>
               <w:rPr>
@@ -2872,13 +2939,13 @@
               <w14:ligatures w14:val="standardContextual"/>
             </w:rPr>
           </w:pPr>
-          <w:hyperlink w:anchor="_Toc243772845" w:history="1">
+          <w:hyperlink w:anchor="_Toc243775135" w:history="1">
             <w:r>
               <w:rPr>
                 <w:rStyle w:val="Hyperlink"/>
                 <w:noProof/>
               </w:rPr>
-              <w:t>12.4 Housekeeping</w:t>
+              <w:t>12.4 Known limitations</w:t>
             </w:r>
             <w:r>
               <w:rPr>
@@ -2896,7 +2963,7 @@
               <w:rPr>
                 <w:noProof/>
               </w:rPr>
-              <w:instrText xml:space="preserve"> PAGEREF _Toc243772845 \h </w:instrText>
+              <w:instrText xml:space="preserve"> PAGEREF _Toc243775135 \h </w:instrText>
             </w:r>
             <w:r>
               <w:rPr>
@@ -2914,6 +2981,73 @@
                 <w:noProof/>
               </w:rPr>
               <w:t>24</w:t>
+            </w:r>
+            <w:r>
+              <w:rPr>
+                <w:noProof/>
+              </w:rPr>
+              <w:fldChar w:fldCharType="end"/>
+            </w:r>
+          </w:hyperlink>
+        </w:p>
+        <w:p>
+          <w:pPr>
+            <w:pStyle w:val="TOC2"/>
+            <w:tabs>
+              <w:tab w:val="right" w:leader="dot" w:pos="9628"/>
+            </w:tabs>
+            <w:rPr>
+              <w:rFonts w:asciiTheme="minorHAnsi" w:eastAsiaTheme="minorEastAsia" w:hAnsiTheme="minorHAnsi" w:cstheme="minorBidi"/>
+              <w:noProof/>
+              <w:color w:val="auto"/>
+              <w:kern w:val="2"/>
+              <w:sz w:val="24"/>
+              <w:szCs w:val="24"/>
+              <w14:ligatures w14:val="standardContextual"/>
+            </w:rPr>
+          </w:pPr>
+          <w:hyperlink w:anchor="_Toc243775136" w:history="1">
+            <w:r>
+              <w:rPr>
+                <w:rStyle w:val="Hyperlink"/>
+                <w:noProof/>
+              </w:rPr>
+              <w:t>12.5 Repository and housekeeping</w:t>
+            </w:r>
+            <w:r>
+              <w:rPr>
+                <w:noProof/>
+              </w:rPr>
+              <w:tab/>
+            </w:r>
+            <w:r>
+              <w:rPr>
+                <w:noProof/>
+              </w:rPr>
+              <w:fldChar w:fldCharType="begin"/>
+            </w:r>
+            <w:r>
+              <w:rPr>
+                <w:noProof/>
+              </w:rPr>
+              <w:instrText xml:space="preserve"> PAGEREF _Toc243775136 \h </w:instrText>
+            </w:r>
+            <w:r>
+              <w:rPr>
+                <w:noProof/>
+              </w:rPr>
+            </w:r>
+            <w:r>
+              <w:rPr>
+                <w:noProof/>
+              </w:rPr>
+              <w:fldChar w:fldCharType="separate"/>
+            </w:r>
+            <w:r>
+              <w:rPr>
+                <w:noProof/>
+              </w:rPr>
+              <w:t>25</w:t>
             </w:r>
             <w:r>
               <w:rPr>
@@ -2939,7 +3073,7 @@
               <w14:ligatures w14:val="standardContextual"/>
             </w:rPr>
           </w:pPr>
-          <w:hyperlink w:anchor="_Toc243772846" w:history="1">
+          <w:hyperlink w:anchor="_Toc243775137" w:history="1">
             <w:r>
               <w:rPr>
                 <w:rStyle w:val="Hyperlink"/>
@@ -2963,7 +3097,7 @@
               <w:rPr>
                 <w:noProof/>
               </w:rPr>
-              <w:instrText xml:space="preserve"> PAGEREF _Toc243772846 \h </w:instrText>
+              <w:instrText xml:space="preserve"> PAGEREF _Toc243775137 \h </w:instrText>
             </w:r>
             <w:r>
               <w:rPr>
@@ -2980,7 +3114,7 @@
               <w:rPr>
                 <w:noProof/>
               </w:rPr>
-              <w:t>25</w:t>
+              <w:t>26</w:t>
             </w:r>
             <w:r>
               <w:rPr>
@@ -3006,7 +3140,7 @@
               <w14:ligatures w14:val="standardContextual"/>
             </w:rPr>
           </w:pPr>
-          <w:hyperlink w:anchor="_Toc243772847" w:history="1">
+          <w:hyperlink w:anchor="_Toc243775138" w:history="1">
             <w:r>
               <w:rPr>
                 <w:rStyle w:val="Hyperlink"/>
@@ -3030,7 +3164,7 @@
               <w:rPr>
                 <w:noProof/>
               </w:rPr>
-              <w:instrText xml:space="preserve"> PAGEREF _Toc243772847 \h </w:instrText>
+              <w:instrText xml:space="preserve"> PAGEREF _Toc243775138 \h </w:instrText>
             </w:r>
             <w:r>
               <w:rPr>
@@ -3047,7 +3181,7 @@
               <w:rPr>
                 <w:noProof/>
               </w:rPr>
-              <w:t>25</w:t>
+              <w:t>26</w:t>
             </w:r>
             <w:r>
               <w:rPr>
@@ -3073,7 +3207,7 @@
               <w14:ligatures w14:val="standardContextual"/>
             </w:rPr>
           </w:pPr>
-          <w:hyperlink w:anchor="_Toc243772848" w:history="1">
+          <w:hyperlink w:anchor="_Toc243775139" w:history="1">
             <w:r>
               <w:rPr>
                 <w:rStyle w:val="Hyperlink"/>
@@ -3097,7 +3231,7 @@
               <w:rPr>
                 <w:noProof/>
               </w:rPr>
-              <w:instrText xml:space="preserve"> PAGEREF _Toc243772848 \h </w:instrText>
+              <w:instrText xml:space="preserve"> PAGEREF _Toc243775139 \h </w:instrText>
             </w:r>
             <w:r>
               <w:rPr>
@@ -3114,7 +3248,7 @@
               <w:rPr>
                 <w:noProof/>
               </w:rPr>
-              <w:t>25</w:t>
+              <w:t>26</w:t>
             </w:r>
             <w:r>
               <w:rPr>
@@ -3140,7 +3274,7 @@
               <w14:ligatures w14:val="standardContextual"/>
             </w:rPr>
           </w:pPr>
-          <w:hyperlink w:anchor="_Toc243772849" w:history="1">
+          <w:hyperlink w:anchor="_Toc243775140" w:history="1">
             <w:r>
               <w:rPr>
                 <w:rStyle w:val="Hyperlink"/>
@@ -3164,7 +3298,7 @@
               <w:rPr>
                 <w:noProof/>
               </w:rPr>
-              <w:instrText xml:space="preserve"> PAGEREF _Toc243772849 \h </w:instrText>
+              <w:instrText xml:space="preserve"> PAGEREF _Toc243775140 \h </w:instrText>
             </w:r>
             <w:r>
               <w:rPr>
@@ -3181,7 +3315,7 @@
               <w:rPr>
                 <w:noProof/>
               </w:rPr>
-              <w:t>26</w:t>
+              <w:t>27</w:t>
             </w:r>
             <w:r>
               <w:rPr>
@@ -3207,7 +3341,7 @@
               <w14:ligatures w14:val="standardContextual"/>
             </w:rPr>
           </w:pPr>
-          <w:hyperlink w:anchor="_Toc243772850" w:history="1">
+          <w:hyperlink w:anchor="_Toc243775141" w:history="1">
             <w:r>
               <w:rPr>
                 <w:rStyle w:val="Hyperlink"/>
@@ -3231,7 +3365,7 @@
               <w:rPr>
                 <w:noProof/>
               </w:rPr>
-              <w:instrText xml:space="preserve"> PAGEREF _Toc243772850 \h </w:instrText>
+              <w:instrText xml:space="preserve"> PAGEREF _Toc243775141 \h </w:instrText>
             </w:r>
             <w:r>
               <w:rPr>
@@ -3248,7 +3382,7 @@
               <w:rPr>
                 <w:noProof/>
               </w:rPr>
-              <w:t>26</w:t>
+              <w:t>27</w:t>
             </w:r>
             <w:r>
               <w:rPr>
@@ -3274,7 +3408,7 @@
               <w14:ligatures w14:val="standardContextual"/>
             </w:rPr>
           </w:pPr>
-          <w:hyperlink w:anchor="_Toc243772851" w:history="1">
+          <w:hyperlink w:anchor="_Toc243775142" w:history="1">
             <w:r>
               <w:rPr>
                 <w:rStyle w:val="Hyperlink"/>
@@ -3298,7 +3432,7 @@
               <w:rPr>
                 <w:noProof/>
               </w:rPr>
-              <w:instrText xml:space="preserve"> PAGEREF _Toc243772851 \h </w:instrText>
+              <w:instrText xml:space="preserve"> PAGEREF _Toc243775142 \h </w:instrText>
             </w:r>
             <w:r>
               <w:rPr>
@@ -3315,7 +3449,7 @@
               <w:rPr>
                 <w:noProof/>
               </w:rPr>
-              <w:t>26</w:t>
+              <w:t>27</w:t>
             </w:r>
             <w:r>
               <w:rPr>
@@ -3337,7 +3471,7 @@
         <w:pStyle w:val="Heading1"/>
         <w:pageBreakBefore/>
       </w:pPr>
-      <w:bookmarkStart w:id="0" w:name="_Toc243772805"/>
+      <w:bookmarkStart w:id="0" w:name="_Toc243775094"/>
       <w:r>
         <w:t>1. Executive summary</w:t>
       </w:r>
@@ -3669,7 +3803,7 @@
                 <w:sz w:val="19"/>
                 <w:szCs w:val="19"/>
               </w:rPr>
-              <w:t>24 test files, about 4,100 lines; 194 tests, 0 failures (last full run 22 Oct 2026)</w:t>
+              <w:t>24 test files, about 4,100 lines; 196 tests, 0 failures (last full run 24 Oct 2026)</w:t>
             </w:r>
           </w:p>
         </w:tc>
@@ -3729,7 +3863,7 @@
                 <w:sz w:val="19"/>
                 <w:szCs w:val="19"/>
               </w:rPr>
-              <w:t>8 HTML pages, 27 JavaScript modules (about 3,800 lines), 4 stylesheets (about 3,100 lines)</w:t>
+              <w:t>11 HTML pages (incl. public home, help and 404), 32 JavaScript files (about 4,100 lines), 6 stylesheets (about 3,700 lines)</w:t>
             </w:r>
           </w:p>
         </w:tc>
@@ -3913,7 +4047,22 @@
                 <w:sz w:val="19"/>
                 <w:szCs w:val="19"/>
               </w:rPr>
-              <w:t>231 checks passed (22 Oct 2026) — run against test doubles, see section 11</w:t>
+              <w:t>In the project since 24 Oct (</w:t>
+            </w:r>
+            <w:r>
+              <w:rPr>
+                <w:rFonts w:ascii="Consolas" w:eastAsia="Consolas" w:hAnsi="Consolas" w:cs="Consolas"/>
+                <w:sz w:val="19"/>
+                <w:szCs w:val="19"/>
+              </w:rPr>
+              <w:t>tests/ui</w:t>
+            </w:r>
+            <w:r>
+              <w:rPr>
+                <w:sz w:val="19"/>
+                <w:szCs w:val="19"/>
+              </w:rPr>
+              <w:t>): 105 checks, 0 failures — run against test doubles, see section 11</w:t>
             </w:r>
           </w:p>
         </w:tc>
@@ -3953,7 +4102,7 @@
         <w:pStyle w:val="Heading1"/>
         <w:pageBreakBefore/>
       </w:pPr>
-      <w:bookmarkStart w:id="1" w:name="_Toc243772806"/>
+      <w:bookmarkStart w:id="1" w:name="_Toc243775095"/>
       <w:r>
         <w:t>2. Technology stack</w:t>
       </w:r>
@@ -5067,7 +5216,7 @@
         <w:pStyle w:val="Heading1"/>
         <w:pageBreakBefore/>
       </w:pPr>
-      <w:bookmarkStart w:id="2" w:name="_Toc243772807"/>
+      <w:bookmarkStart w:id="2" w:name="_Toc243775096"/>
       <w:r>
         <w:t>3. Architecture</w:t>
       </w:r>
@@ -5085,7 +5234,7 @@
       <w:pPr>
         <w:pStyle w:val="Heading2"/>
       </w:pPr>
-      <w:bookmarkStart w:id="3" w:name="_Toc243772808"/>
+      <w:bookmarkStart w:id="3" w:name="_Toc243775097"/>
       <w:r>
         <w:t>3.1 Request path</w:t>
       </w:r>
@@ -5319,7 +5468,7 @@
       <w:pPr>
         <w:pStyle w:val="Heading2"/>
       </w:pPr>
-      <w:bookmarkStart w:id="4" w:name="_Toc243772809"/>
+      <w:bookmarkStart w:id="4" w:name="_Toc243775098"/>
       <w:r>
         <w:t>3.2 Backend package layout</w:t>
       </w:r>
@@ -6357,7 +6506,7 @@
       <w:pPr>
         <w:pStyle w:val="Heading2"/>
       </w:pPr>
-      <w:bookmarkStart w:id="5" w:name="_Toc243772810"/>
+      <w:bookmarkStart w:id="5" w:name="_Toc243775099"/>
       <w:r>
         <w:t>3.3 Frontend layout</w:t>
       </w:r>
@@ -7264,7 +7413,7 @@
         <w:pStyle w:val="Heading1"/>
         <w:pageBreakBefore/>
       </w:pPr>
-      <w:bookmarkStart w:id="6" w:name="_Toc243772811"/>
+      <w:bookmarkStart w:id="6" w:name="_Toc243775100"/>
       <w:r>
         <w:t>4. Features delivered</w:t>
       </w:r>
@@ -7274,7 +7423,7 @@
       <w:pPr>
         <w:pStyle w:val="Heading2"/>
       </w:pPr>
-      <w:bookmarkStart w:id="7" w:name="_Toc243772812"/>
+      <w:bookmarkStart w:id="7" w:name="_Toc243775101"/>
       <w:r>
         <w:t>4.1 Login and registration</w:t>
       </w:r>
@@ -7401,7 +7550,7 @@
       <w:pPr>
         <w:pStyle w:val="Heading2"/>
       </w:pPr>
-      <w:bookmarkStart w:id="8" w:name="_Toc243772813"/>
+      <w:bookmarkStart w:id="8" w:name="_Toc243775102"/>
       <w:r>
         <w:t>4.2 Roles and account control</w:t>
       </w:r>
@@ -7472,7 +7621,7 @@
       <w:pPr>
         <w:pStyle w:val="Heading2"/>
       </w:pPr>
-      <w:bookmarkStart w:id="9" w:name="_Toc243772814"/>
+      <w:bookmarkStart w:id="9" w:name="_Toc243775103"/>
       <w:r>
         <w:t>4.3 User dashboard</w:t>
       </w:r>
@@ -8082,7 +8231,7 @@
       <w:pPr>
         <w:pStyle w:val="Heading2"/>
       </w:pPr>
-      <w:bookmarkStart w:id="10" w:name="_Toc243772815"/>
+      <w:bookmarkStart w:id="10" w:name="_Toc243775104"/>
       <w:r>
         <w:t>4.4 Emergency contacts: consent and verification</w:t>
       </w:r>
@@ -8177,7 +8326,7 @@
       <w:pPr>
         <w:pStyle w:val="Heading2"/>
       </w:pPr>
-      <w:bookmarkStart w:id="11" w:name="_Toc243772816"/>
+      <w:bookmarkStart w:id="11" w:name="_Toc243775105"/>
       <w:r>
         <w:t>4.5 SOS emergency alert system</w:t>
       </w:r>
@@ -8922,7 +9071,7 @@
       <w:pPr>
         <w:pStyle w:val="Heading2"/>
       </w:pPr>
-      <w:bookmarkStart w:id="12" w:name="_Toc243772817"/>
+      <w:bookmarkStart w:id="12" w:name="_Toc243775106"/>
       <w:r>
         <w:t>4.6 Notification delivery architecture</w:t>
       </w:r>
@@ -9176,7 +9325,7 @@
       <w:pPr>
         <w:pStyle w:val="Heading2"/>
       </w:pPr>
-      <w:bookmarkStart w:id="13" w:name="_Toc243772818"/>
+      <w:bookmarkStart w:id="13" w:name="_Toc243775107"/>
       <w:r>
         <w:t>4.7 TEST mode and REAL mode</w:t>
       </w:r>
@@ -9684,7 +9833,7 @@
       <w:pPr>
         <w:pStyle w:val="Heading2"/>
       </w:pPr>
-      <w:bookmarkStart w:id="14" w:name="_Toc243772819"/>
+      <w:bookmarkStart w:id="14" w:name="_Toc243775108"/>
       <w:r>
         <w:t>4.8 Administrator console</w:t>
       </w:r>
@@ -10271,7 +10420,7 @@
       <w:pPr>
         <w:pStyle w:val="Heading2"/>
       </w:pPr>
-      <w:bookmarkStart w:id="15" w:name="_Toc243772820"/>
+      <w:bookmarkStart w:id="15" w:name="_Toc243775109"/>
       <w:r>
         <w:t>4.9 Audit logging</w:t>
       </w:r>
@@ -10307,7 +10456,7 @@
       <w:pPr>
         <w:pStyle w:val="Heading2"/>
       </w:pPr>
-      <w:bookmarkStart w:id="16" w:name="_Toc243772821"/>
+      <w:bookmarkStart w:id="16" w:name="_Toc243775110"/>
       <w:r>
         <w:t>4.10 Data retention</w:t>
       </w:r>
@@ -10390,7 +10539,7 @@
         <w:pStyle w:val="Heading1"/>
         <w:pageBreakBefore/>
       </w:pPr>
-      <w:bookmarkStart w:id="17" w:name="_Toc243772822"/>
+      <w:bookmarkStart w:id="17" w:name="_Toc243775111"/>
       <w:r>
         <w:t>5. API reference</w:t>
       </w:r>
@@ -10492,7 +10641,7 @@
       <w:pPr>
         <w:pStyle w:val="Heading2"/>
       </w:pPr>
-      <w:bookmarkStart w:id="18" w:name="_Toc243772823"/>
+      <w:bookmarkStart w:id="18" w:name="_Toc243775112"/>
       <w:r>
         <w:t>5.1 Session and profile</w:t>
       </w:r>
@@ -10835,7 +10984,7 @@
       <w:pPr>
         <w:pStyle w:val="Heading2"/>
       </w:pPr>
-      <w:bookmarkStart w:id="19" w:name="_Toc243772824"/>
+      <w:bookmarkStart w:id="19" w:name="_Toc243775113"/>
       <w:r>
         <w:t>5.2 Emergency contacts, SOS and reports</w:t>
       </w:r>
@@ -11566,7 +11715,7 @@
       <w:pPr>
         <w:pStyle w:val="Heading2"/>
       </w:pPr>
-      <w:bookmarkStart w:id="20" w:name="_Toc243772825"/>
+      <w:bookmarkStart w:id="20" w:name="_Toc243775114"/>
       <w:r>
         <w:t>5.3 Administrator (ROLE_ADMIN only)</w:t>
       </w:r>
@@ -12562,7 +12711,7 @@
       <w:pPr>
         <w:pStyle w:val="Heading2"/>
       </w:pPr>
-      <w:bookmarkStart w:id="21" w:name="_Toc243772826"/>
+      <w:bookmarkStart w:id="21" w:name="_Toc243775115"/>
       <w:r>
         <w:t>5.4 Public (signature-checked)</w:t>
       </w:r>
@@ -12737,7 +12886,7 @@
         <w:pStyle w:val="Heading1"/>
         <w:pageBreakBefore/>
       </w:pPr>
-      <w:bookmarkStart w:id="22" w:name="_Toc243772827"/>
+      <w:bookmarkStart w:id="22" w:name="_Toc243775116"/>
       <w:r>
         <w:t>6. Data model and Firestore security rules</w:t>
       </w:r>
@@ -13404,7 +13553,7 @@
       <w:pPr>
         <w:pStyle w:val="Heading2"/>
       </w:pPr>
-      <w:bookmarkStart w:id="23" w:name="_Toc243772828"/>
+      <w:bookmarkStart w:id="23" w:name="_Toc243775117"/>
       <w:r>
         <w:t>6.1 Security rules</w:t>
       </w:r>
@@ -13618,7 +13767,7 @@
         <w:pStyle w:val="Heading1"/>
         <w:pageBreakBefore/>
       </w:pPr>
-      <w:bookmarkStart w:id="24" w:name="_Toc243772829"/>
+      <w:bookmarkStart w:id="24" w:name="_Toc243775118"/>
       <w:r>
         <w:t>7. Security and privacy measures</w:t>
       </w:r>
@@ -13866,7 +14015,7 @@
         <w:pStyle w:val="Heading1"/>
         <w:pageBreakBefore/>
       </w:pPr>
-      <w:bookmarkStart w:id="25" w:name="_Toc243772830"/>
+      <w:bookmarkStart w:id="25" w:name="_Toc243775119"/>
       <w:r>
         <w:t>8. Configuration</w:t>
       </w:r>
@@ -13876,7 +14025,7 @@
       <w:pPr>
         <w:pStyle w:val="Heading2"/>
       </w:pPr>
-      <w:bookmarkStart w:id="26" w:name="_Toc243772831"/>
+      <w:bookmarkStart w:id="26" w:name="_Toc243775120"/>
       <w:r>
         <w:t>8.1 Backend environment variables</w:t>
       </w:r>
@@ -15850,7 +15999,7 @@
       <w:pPr>
         <w:pStyle w:val="Heading2"/>
       </w:pPr>
-      <w:bookmarkStart w:id="27" w:name="_Toc243772832"/>
+      <w:bookmarkStart w:id="27" w:name="_Toc243775121"/>
       <w:r>
         <w:t>8.2 Frontend settings (js/config.js)</w:t>
       </w:r>
@@ -16030,7 +16179,7 @@
       <w:pPr>
         <w:pStyle w:val="Heading2"/>
       </w:pPr>
-      <w:bookmarkStart w:id="28" w:name="_Toc243772833"/>
+      <w:bookmarkStart w:id="28" w:name="_Toc243775122"/>
       <w:r>
         <w:t>8.3 Manual Firebase console steps</w:t>
       </w:r>
@@ -16213,7 +16362,7 @@
         <w:pStyle w:val="Heading1"/>
         <w:pageBreakBefore/>
       </w:pPr>
-      <w:bookmarkStart w:id="29" w:name="_Toc243772834"/>
+      <w:bookmarkStart w:id="29" w:name="_Toc243775123"/>
       <w:r>
         <w:t>9. Key code excerpts</w:t>
       </w:r>
@@ -17252,7 +17401,7 @@
         <w:pStyle w:val="Heading1"/>
         <w:pageBreakBefore/>
       </w:pPr>
-      <w:bookmarkStart w:id="30" w:name="_Toc243772835"/>
+      <w:bookmarkStart w:id="30" w:name="_Toc243775124"/>
       <w:r>
         <w:t>10. How to run the website locally</w:t>
       </w:r>
@@ -17484,7 +17633,7 @@
         <w:pStyle w:val="Heading1"/>
         <w:pageBreakBefore/>
       </w:pPr>
-      <w:bookmarkStart w:id="31" w:name="_Toc243772836"/>
+      <w:bookmarkStart w:id="31" w:name="_Toc243775125"/>
       <w:r>
         <w:t>11. Testing — what was actually run</w:t>
       </w:r>
@@ -17495,14 +17644,14 @@
         <w:spacing w:after="120" w:line="276" w:lineRule="auto"/>
       </w:pPr>
       <w:r>
-        <w:t>This section lists only tests that were executed, with their results and dates. Everything changed after the last run is listed separately.</w:t>
+        <w:t>This section lists only tests that were executed, with their results and dates. What was changed without a test run is listed separately, and 11.5 lists the checks made for each phase 1 item.</w:t>
       </w:r>
     </w:p>
     <w:p>
       <w:pPr>
         <w:pStyle w:val="Heading2"/>
       </w:pPr>
-      <w:bookmarkStart w:id="32" w:name="_Toc243772837"/>
+      <w:bookmarkStart w:id="32" w:name="_Toc243775126"/>
       <w:r>
         <w:t>11.1 Backend automated tests (Maven)</w:t>
       </w:r>
@@ -17532,7 +17681,10 @@
           <w:b/>
           <w:bCs/>
         </w:rPr>
-        <w:t>Last full run: 22 Oct 2026 — 194 tests, 0 failures, 0 errors.</w:t>
+        <w:t>Last full run: 24 Oct 2026 — 196 tests, 0 failures, 0 errors</w:t>
+      </w:r>
+      <w:r>
+        <w:t xml:space="preserve"> (previous run 22 Oct: 194).</w:t>
       </w:r>
     </w:p>
     <w:tbl>
@@ -17803,7 +17955,7 @@
                 <w:sz w:val="19"/>
                 <w:szCs w:val="19"/>
               </w:rPr>
-              <w:t>7</w:t>
+              <w:t>9</w:t>
             </w:r>
           </w:p>
         </w:tc>
@@ -17833,7 +17985,7 @@
                 <w:sz w:val="19"/>
                 <w:szCs w:val="19"/>
               </w:rPr>
-              <w:t>Own profile only, name changes</w:t>
+              <w:t>Own profile only, name changes; new: the SOS-drill flag is set only on the caller's own profile and touches no alert, delivery, job, contact or device data; the endpoint needs a phone token</w:t>
             </w:r>
           </w:p>
         </w:tc>
@@ -18465,7 +18617,7 @@
                 <w:sz w:val="19"/>
                 <w:szCs w:val="19"/>
               </w:rPr>
-              <w:t>New admin SOS routes 403/401, masking, id search, flags, detail audit, deliveries, transitions, devices, overview, stream</w:t>
+              <w:t>Admin SOS routes 403/401, masking, id search, flags, detail audit, deliveries, transitions, devices, overview, stream</w:t>
             </w:r>
           </w:p>
         </w:tc>
@@ -19199,7 +19351,7 @@
       <w:pPr>
         <w:pStyle w:val="Heading2"/>
       </w:pPr>
-      <w:bookmarkStart w:id="33" w:name="_Toc243772838"/>
+      <w:bookmarkStart w:id="33" w:name="_Toc243775127"/>
       <w:r>
         <w:t>11.2 Browser UI suite (headless Microsoft Edge)</w:t>
       </w:r>
@@ -19210,20 +19362,29 @@
         <w:spacing w:after="120" w:line="276" w:lineRule="auto"/>
       </w:pPr>
       <w:r>
-        <w:t xml:space="preserve">The real frontend code was driven in headless Edge against test doubles of Firebase phone auth and of the API (so it checks UI behaviour, not the real services). Latest run 22 Oct 2026: </w:t>
+        <w:t xml:space="preserve">Since 24 Oct 2026 the suite lives in the project: </w:t>
+      </w:r>
+      <w:r>
+        <w:rPr>
+          <w:rFonts w:ascii="Consolas" w:eastAsia="Consolas" w:hAnsi="Consolas" w:cs="Consolas"/>
+          <w:color w:val="4A2470"/>
+          <w:sz w:val="19"/>
+          <w:szCs w:val="19"/>
+        </w:rPr>
+        <w:t>tests/ui/run.mjs</w:t>
+      </w:r>
+      <w:r>
+        <w:t xml:space="preserve"> (no dependencies; Node 22+). It drives the real frontend code in headless Edge against a fake Firebase SDK and an in-process mock of the API, so it checks browser behaviour, not the real services. </w:t>
       </w:r>
       <w:r>
         <w:rPr>
           <w:b/>
           <w:bCs/>
         </w:rPr>
-        <w:t>231 checks passed, 0 failed.</w:t>
-      </w:r>
-      <w:r>
-        <w:t xml:space="preserve"> Covered: registration and login validation and errors, dashboard sections, contacts including consent and verification, SOS flow (separate creation and notification status, processing → settled states, REAL-mode wording for accepted / delivered / failed / partial, triple-click creates one request, retry reuses the key, location unavailable, status unavailable), admin login and access control, every admin view, SOS search, delivery records, opt-in map, live updates (connect, new-alert badge, reconnect, poll</w:t>
-      </w:r>
-      <w:r>
-        <w:t>ing fallback, stale warning), responsive layout at 1440 / 768 / 390 px with no horizontal scrolling.</w:t>
+        <w:t>Run on 24 Oct 2026: 105 checks, 0 failures.</w:t>
+      </w:r>
+      <w:r>
+        <w:t xml:space="preserve"> It covers the phase 1 work (section 11.5), source rules for the new modules, registration through the UI, a regression of the real SOS flow (one alert per press, Idempotency-Key sent, status settles to "Test only — nothing sent"), and responsive layout at 1440 / 768 / 390 px.</w:t>
       </w:r>
     </w:p>
     <w:p>
@@ -19239,14 +19400,28 @@
         <w:rPr>
           <w:color w:val="6B4700"/>
         </w:rPr>
-        <w:t>These test scripts were kept in a temporary working folder, not in the project, and that folder has since been cleared. To repeat this suite the scripts would need to be recreated and added to the project.</w:t>
+        <w:t xml:space="preserve">The earlier suite (231 checks, last run 22 Oct 2026) lived in a temporary folder that has since been cleared. Its coverage of the admin console, the full contact-verification dialog, the SOS status wording in REAL mode and the admin live updates has </w:t>
+      </w:r>
+      <w:r>
+        <w:rPr>
+          <w:b/>
+          <w:bCs/>
+          <w:color w:val="6B4700"/>
+        </w:rPr>
+        <w:t>not</w:t>
+      </w:r>
+      <w:r>
+        <w:rPr>
+          <w:color w:val="6B4700"/>
+        </w:rPr>
+        <w:t xml:space="preserve"> been rebuilt in the new suite; those areas currently have backend tests only.</w:t>
       </w:r>
     </w:p>
     <w:p>
       <w:pPr>
         <w:pStyle w:val="Heading2"/>
       </w:pPr>
-      <w:bookmarkStart w:id="34" w:name="_Toc243772839"/>
+      <w:bookmarkStart w:id="34" w:name="_Toc243775128"/>
       <w:r>
         <w:t>11.3 Real end-to-end tests (live Firebase, real backend, real Firestore)</w:t>
       </w:r>
@@ -19257,7 +19432,7 @@
         <w:spacing w:after="120" w:line="276" w:lineRule="auto"/>
       </w:pPr>
       <w:r>
-        <w:t>Using only the fictional test number configured in Firebase; all records created by these runs were deleted afterwards, except as noted.</w:t>
+        <w:t>Using only the fictional test number configured in Firebase.</w:t>
       </w:r>
     </w:p>
     <w:tbl>
@@ -19744,6 +19919,110 @@
           </w:p>
         </w:tc>
       </w:tr>
+      <w:tr>
+        <w:tc>
+          <w:tcPr>
+            <w:tcW w:w="1700" w:type="dxa"/>
+            <w:tcBorders>
+              <w:top w:val="single" w:sz="4" w:space="0" w:color="D9CFE8"/>
+              <w:left w:val="single" w:sz="4" w:space="0" w:color="D9CFE8"/>
+              <w:bottom w:val="single" w:sz="4" w:space="0" w:color="D9CFE8"/>
+              <w:right w:val="single" w:sz="4" w:space="0" w:color="D9CFE8"/>
+            </w:tcBorders>
+            <w:tcMar>
+              <w:top w:w="60" w:type="dxa"/>
+              <w:left w:w="100" w:type="dxa"/>
+              <w:bottom w:w="60" w:type="dxa"/>
+              <w:right w:w="100" w:type="dxa"/>
+            </w:tcMar>
+          </w:tcPr>
+          <w:p>
+            <w:pPr>
+              <w:spacing w:after="20" w:line="252" w:lineRule="auto"/>
+            </w:pPr>
+            <w:r>
+              <w:rPr>
+                <w:sz w:val="19"/>
+                <w:szCs w:val="19"/>
+              </w:rPr>
+              <w:t>24 Oct 2026</w:t>
+            </w:r>
+          </w:p>
+        </w:tc>
+        <w:tc>
+          <w:tcPr>
+            <w:tcW w:w="5300" w:type="dxa"/>
+            <w:tcBorders>
+              <w:top w:val="single" w:sz="4" w:space="0" w:color="D9CFE8"/>
+              <w:left w:val="single" w:sz="4" w:space="0" w:color="D9CFE8"/>
+              <w:bottom w:val="single" w:sz="4" w:space="0" w:color="D9CFE8"/>
+              <w:right w:val="single" w:sz="4" w:space="0" w:color="D9CFE8"/>
+            </w:tcBorders>
+            <w:tcMar>
+              <w:top w:w="60" w:type="dxa"/>
+              <w:left w:w="100" w:type="dxa"/>
+              <w:bottom w:w="60" w:type="dxa"/>
+              <w:right w:w="100" w:type="dxa"/>
+            </w:tcMar>
+          </w:tcPr>
+          <w:p>
+            <w:pPr>
+              <w:spacing w:after="20" w:line="252" w:lineRule="auto"/>
+            </w:pPr>
+            <w:r>
+              <w:rPr>
+                <w:sz w:val="19"/>
+                <w:szCs w:val="19"/>
+              </w:rPr>
+              <w:t xml:space="preserve">Backend restarted from the phase 1 build; </w:t>
+            </w:r>
+            <w:r>
+              <w:rPr>
+                <w:rFonts w:ascii="Consolas" w:eastAsia="Consolas" w:hAnsi="Consolas" w:cs="Consolas"/>
+                <w:sz w:val="19"/>
+                <w:szCs w:val="19"/>
+              </w:rPr>
+              <w:t>POST /api/users/me/sos-drill</w:t>
+            </w:r>
+            <w:r>
+              <w:rPr>
+                <w:sz w:val="19"/>
+                <w:szCs w:val="19"/>
+              </w:rPr>
+              <w:t xml:space="preserve"> without a token</w:t>
+            </w:r>
+          </w:p>
+        </w:tc>
+        <w:tc>
+          <w:tcPr>
+            <w:tcW w:w="2638" w:type="dxa"/>
+            <w:tcBorders>
+              <w:top w:val="single" w:sz="4" w:space="0" w:color="D9CFE8"/>
+              <w:left w:val="single" w:sz="4" w:space="0" w:color="D9CFE8"/>
+              <w:bottom w:val="single" w:sz="4" w:space="0" w:color="D9CFE8"/>
+              <w:right w:val="single" w:sz="4" w:space="0" w:color="D9CFE8"/>
+            </w:tcBorders>
+            <w:tcMar>
+              <w:top w:w="60" w:type="dxa"/>
+              <w:left w:w="100" w:type="dxa"/>
+              <w:bottom w:w="60" w:type="dxa"/>
+              <w:right w:w="100" w:type="dxa"/>
+            </w:tcMar>
+          </w:tcPr>
+          <w:p>
+            <w:pPr>
+              <w:spacing w:after="20" w:line="252" w:lineRule="auto"/>
+            </w:pPr>
+            <w:r>
+              <w:rPr>
+                <w:sz w:val="19"/>
+                <w:szCs w:val="19"/>
+              </w:rPr>
+              <w:t>401 as expected (no signed-in check)</w:t>
+            </w:r>
+          </w:p>
+        </w:tc>
+      </w:tr>
     </w:tbl>
     <w:p>
       <w:pPr>
@@ -19790,16 +20069,16 @@
         <w:t>not been confirmed against the live services</w:t>
       </w:r>
       <w:r>
-        <w:t>. A second run was stopped on request before completion.</w:t>
+        <w:t>.</w:t>
       </w:r>
     </w:p>
     <w:p>
       <w:pPr>
         <w:pStyle w:val="Heading2"/>
       </w:pPr>
-      <w:bookmarkStart w:id="35" w:name="_Toc243772840"/>
-      <w:r>
-        <w:t>11.4 Changes made after the last test runs (not yet tested)</w:t>
+      <w:bookmarkStart w:id="35" w:name="_Toc243775129"/>
+      <w:r>
+        <w:t>11.4 Changed without a dedicated test</w:t>
       </w:r>
       <w:bookmarkEnd w:id="35"/>
     </w:p>
@@ -19813,7 +20092,19 @@
         <w:spacing w:after="60" w:line="264" w:lineRule="auto"/>
       </w:pPr>
       <w:r>
-        <w:t>Retention purge job (24 Oct) — compiled and the backend started successfully.</w:t>
+        <w:t xml:space="preserve">Retention purge job (24 Oct): compiled, part of the passing </w:t>
+      </w:r>
+      <w:r>
+        <w:rPr>
+          <w:rFonts w:ascii="Consolas" w:eastAsia="Consolas" w:hAnsi="Consolas" w:cs="Consolas"/>
+          <w:color w:val="4A2470"/>
+          <w:sz w:val="19"/>
+          <w:szCs w:val="19"/>
+        </w:rPr>
+        <w:t>mvnw verify</w:t>
+      </w:r>
+      <w:r>
+        <w:t xml:space="preserve"> build, and the backend starts with it — but no test exercises the purge itself.</w:t>
       </w:r>
     </w:p>
     <w:p>
@@ -19826,7 +20117,7 @@
         <w:spacing w:after="60" w:line="264" w:lineRule="auto"/>
       </w:pPr>
       <w:r>
-        <w:t>Sign-in error messages that show the Firebase error code (24 Oct).</w:t>
+        <w:t>Sign-in error messages that show the Firebase error code (24 Oct): no automated check triggers an unknown Firebase error.</w:t>
       </w:r>
     </w:p>
     <w:p>
@@ -19839,7 +20130,25 @@
         <w:spacing w:after="60" w:line="264" w:lineRule="auto"/>
       </w:pPr>
       <w:r>
-        <w:t xml:space="preserve">Root </w:t>
+        <w:t>Verification dialog no longer repeats the TEST MODE message (22 Oct): the UI suite verifies with the shown code but does not check this wording.</w:t>
+      </w:r>
+    </w:p>
+    <w:p>
+      <w:pPr>
+        <w:pStyle w:val="Heading2"/>
+      </w:pPr>
+      <w:bookmarkStart w:id="36" w:name="_Toc243775130"/>
+      <w:r>
+        <w:t>11.5 Phase 1 pages (24 Oct 2026) — what was run per item</w:t>
+      </w:r>
+      <w:bookmarkEnd w:id="36"/>
+    </w:p>
+    <w:p>
+      <w:pPr>
+        <w:spacing w:after="120" w:line="276" w:lineRule="auto"/>
+      </w:pPr>
+      <w:r>
+        <w:t xml:space="preserve">Work done on the local Git branch </w:t>
       </w:r>
       <w:r>
         <w:rPr>
@@ -19848,11 +20157,590 @@
           <w:sz w:val="19"/>
           <w:szCs w:val="19"/>
         </w:rPr>
-        <w:t>index.html</w:t>
-      </w:r>
-      <w:r>
-        <w:t xml:space="preserve"> redirect to the login page on localhost (24 Oct).</w:t>
-      </w:r>
+        <w:t>feature/phase1-pages</w:t>
+      </w:r>
+      <w:r>
+        <w:t xml:space="preserve"> (one commit per item; nothing pushed). Checks below are from </w:t>
+      </w:r>
+      <w:r>
+        <w:rPr>
+          <w:rFonts w:ascii="Consolas" w:eastAsia="Consolas" w:hAnsi="Consolas" w:cs="Consolas"/>
+          <w:color w:val="4A2470"/>
+          <w:sz w:val="19"/>
+          <w:szCs w:val="19"/>
+        </w:rPr>
+        <w:t>tests/ui/run.mjs</w:t>
+      </w:r>
+      <w:r>
+        <w:t xml:space="preserve"> (105/105 passed) and </w:t>
+      </w:r>
+      <w:r>
+        <w:rPr>
+          <w:rFonts w:ascii="Consolas" w:eastAsia="Consolas" w:hAnsi="Consolas" w:cs="Consolas"/>
+          <w:color w:val="4A2470"/>
+          <w:sz w:val="19"/>
+          <w:szCs w:val="19"/>
+        </w:rPr>
+        <w:t>mvnw verify</w:t>
+      </w:r>
+      <w:r>
+        <w:t xml:space="preserve"> (196/196 passed).</w:t>
+      </w:r>
+    </w:p>
+    <w:tbl>
+      <w:tblPr>
+        <w:tblW w:w="9638" w:type="dxa"/>
+        <w:tblBorders>
+          <w:top w:val="single" w:sz="4" w:space="0" w:color="auto"/>
+          <w:left w:val="single" w:sz="4" w:space="0" w:color="auto"/>
+          <w:bottom w:val="single" w:sz="4" w:space="0" w:color="auto"/>
+          <w:right w:val="single" w:sz="4" w:space="0" w:color="auto"/>
+          <w:insideH w:val="single" w:sz="4" w:space="0" w:color="auto"/>
+          <w:insideV w:val="single" w:sz="4" w:space="0" w:color="auto"/>
+        </w:tblBorders>
+        <w:tblLook w:val="04A0" w:firstRow="1" w:lastRow="0" w:firstColumn="1" w:lastColumn="0" w:noHBand="0" w:noVBand="1"/>
+      </w:tblPr>
+      <w:tblGrid>
+        <w:gridCol w:w="2700"/>
+        <w:gridCol w:w="6938"/>
+      </w:tblGrid>
+      <w:tr>
+        <w:trPr>
+          <w:tblHeader/>
+        </w:trPr>
+        <w:tc>
+          <w:tcPr>
+            <w:tcW w:w="2700" w:type="dxa"/>
+            <w:tcBorders>
+              <w:top w:val="single" w:sz="4" w:space="0" w:color="D9CFE8"/>
+              <w:left w:val="single" w:sz="4" w:space="0" w:color="D9CFE8"/>
+              <w:bottom w:val="single" w:sz="4" w:space="0" w:color="D9CFE8"/>
+              <w:right w:val="single" w:sz="4" w:space="0" w:color="D9CFE8"/>
+            </w:tcBorders>
+            <w:shd w:val="clear" w:color="auto" w:fill="EDE5F7"/>
+            <w:tcMar>
+              <w:top w:w="60" w:type="dxa"/>
+              <w:left w:w="100" w:type="dxa"/>
+              <w:bottom w:w="60" w:type="dxa"/>
+              <w:right w:w="100" w:type="dxa"/>
+            </w:tcMar>
+          </w:tcPr>
+          <w:p>
+            <w:pPr>
+              <w:spacing w:after="20" w:line="252" w:lineRule="auto"/>
+            </w:pPr>
+            <w:r>
+              <w:rPr>
+                <w:b/>
+                <w:bCs/>
+                <w:color w:val="5B2A86"/>
+                <w:sz w:val="19"/>
+                <w:szCs w:val="19"/>
+              </w:rPr>
+              <w:t>Item</w:t>
+            </w:r>
+          </w:p>
+        </w:tc>
+        <w:tc>
+          <w:tcPr>
+            <w:tcW w:w="6938" w:type="dxa"/>
+            <w:tcBorders>
+              <w:top w:val="single" w:sz="4" w:space="0" w:color="D9CFE8"/>
+              <w:left w:val="single" w:sz="4" w:space="0" w:color="D9CFE8"/>
+              <w:bottom w:val="single" w:sz="4" w:space="0" w:color="D9CFE8"/>
+              <w:right w:val="single" w:sz="4" w:space="0" w:color="D9CFE8"/>
+            </w:tcBorders>
+            <w:shd w:val="clear" w:color="auto" w:fill="EDE5F7"/>
+            <w:tcMar>
+              <w:top w:w="60" w:type="dxa"/>
+              <w:left w:w="100" w:type="dxa"/>
+              <w:bottom w:w="60" w:type="dxa"/>
+              <w:right w:w="100" w:type="dxa"/>
+            </w:tcMar>
+          </w:tcPr>
+          <w:p>
+            <w:pPr>
+              <w:spacing w:after="20" w:line="252" w:lineRule="auto"/>
+            </w:pPr>
+            <w:r>
+              <w:rPr>
+                <w:b/>
+                <w:bCs/>
+                <w:color w:val="5B2A86"/>
+                <w:sz w:val="19"/>
+                <w:szCs w:val="19"/>
+              </w:rPr>
+              <w:t>What was checked</w:t>
+            </w:r>
+          </w:p>
+        </w:tc>
+      </w:tr>
+      <w:tr>
+        <w:tc>
+          <w:tcPr>
+            <w:tcW w:w="2700" w:type="dxa"/>
+            <w:tcBorders>
+              <w:top w:val="single" w:sz="4" w:space="0" w:color="D9CFE8"/>
+              <w:left w:val="single" w:sz="4" w:space="0" w:color="D9CFE8"/>
+              <w:bottom w:val="single" w:sz="4" w:space="0" w:color="D9CFE8"/>
+              <w:right w:val="single" w:sz="4" w:space="0" w:color="D9CFE8"/>
+            </w:tcBorders>
+            <w:tcMar>
+              <w:top w:w="60" w:type="dxa"/>
+              <w:left w:w="100" w:type="dxa"/>
+              <w:bottom w:w="60" w:type="dxa"/>
+              <w:right w:w="100" w:type="dxa"/>
+            </w:tcMar>
+          </w:tcPr>
+          <w:p>
+            <w:pPr>
+              <w:spacing w:after="20" w:line="252" w:lineRule="auto"/>
+            </w:pPr>
+            <w:r>
+              <w:rPr>
+                <w:sz w:val="19"/>
+                <w:szCs w:val="19"/>
+              </w:rPr>
+              <w:t>1. Helplines (dashboard + public pages)</w:t>
+            </w:r>
+          </w:p>
+        </w:tc>
+        <w:tc>
+          <w:tcPr>
+            <w:tcW w:w="6938" w:type="dxa"/>
+            <w:tcBorders>
+              <w:top w:val="single" w:sz="4" w:space="0" w:color="D9CFE8"/>
+              <w:left w:val="single" w:sz="4" w:space="0" w:color="D9CFE8"/>
+              <w:bottom w:val="single" w:sz="4" w:space="0" w:color="D9CFE8"/>
+              <w:right w:val="single" w:sz="4" w:space="0" w:color="D9CFE8"/>
+            </w:tcBorders>
+            <w:tcMar>
+              <w:top w:w="60" w:type="dxa"/>
+              <w:left w:w="100" w:type="dxa"/>
+              <w:bottom w:w="60" w:type="dxa"/>
+              <w:right w:w="100" w:type="dxa"/>
+            </w:tcMar>
+          </w:tcPr>
+          <w:p>
+            <w:pPr>
+              <w:spacing w:after="20" w:line="252" w:lineRule="auto"/>
+            </w:pPr>
+            <w:r>
+              <w:rPr>
+                <w:sz w:val="19"/>
+                <w:szCs w:val="19"/>
+              </w:rPr>
+              <w:t xml:space="preserve">The five numbers render from </w:t>
+            </w:r>
+            <w:r>
+              <w:rPr>
+                <w:rFonts w:ascii="Consolas" w:eastAsia="Consolas" w:hAnsi="Consolas" w:cs="Consolas"/>
+                <w:sz w:val="19"/>
+                <w:szCs w:val="19"/>
+              </w:rPr>
+              <w:t>js/config.js</w:t>
+            </w:r>
+            <w:r>
+              <w:rPr>
+                <w:sz w:val="19"/>
+                <w:szCs w:val="19"/>
+              </w:rPr>
+              <w:t xml:space="preserve"> as tel: links with descriptions and accessible labels, on the dashboard, home and help pages; the SOS dialog's call button uses the same config number; no page hardcodes a helpline number (source check); helplines still show when the API fails.</w:t>
+            </w:r>
+          </w:p>
+        </w:tc>
+      </w:tr>
+      <w:tr>
+        <w:tc>
+          <w:tcPr>
+            <w:tcW w:w="2700" w:type="dxa"/>
+            <w:tcBorders>
+              <w:top w:val="single" w:sz="4" w:space="0" w:color="D9CFE8"/>
+              <w:left w:val="single" w:sz="4" w:space="0" w:color="D9CFE8"/>
+              <w:bottom w:val="single" w:sz="4" w:space="0" w:color="D9CFE8"/>
+              <w:right w:val="single" w:sz="4" w:space="0" w:color="D9CFE8"/>
+            </w:tcBorders>
+            <w:shd w:val="clear" w:color="auto" w:fill="FAF7FD"/>
+            <w:tcMar>
+              <w:top w:w="60" w:type="dxa"/>
+              <w:left w:w="100" w:type="dxa"/>
+              <w:bottom w:w="60" w:type="dxa"/>
+              <w:right w:w="100" w:type="dxa"/>
+            </w:tcMar>
+          </w:tcPr>
+          <w:p>
+            <w:pPr>
+              <w:spacing w:after="20" w:line="252" w:lineRule="auto"/>
+            </w:pPr>
+            <w:r>
+              <w:rPr>
+                <w:sz w:val="19"/>
+                <w:szCs w:val="19"/>
+              </w:rPr>
+              <w:t>2. Nearby help</w:t>
+            </w:r>
+          </w:p>
+        </w:tc>
+        <w:tc>
+          <w:tcPr>
+            <w:tcW w:w="6938" w:type="dxa"/>
+            <w:tcBorders>
+              <w:top w:val="single" w:sz="4" w:space="0" w:color="D9CFE8"/>
+              <w:left w:val="single" w:sz="4" w:space="0" w:color="D9CFE8"/>
+              <w:bottom w:val="single" w:sz="4" w:space="0" w:color="D9CFE8"/>
+              <w:right w:val="single" w:sz="4" w:space="0" w:color="D9CFE8"/>
+            </w:tcBorders>
+            <w:shd w:val="clear" w:color="auto" w:fill="FAF7FD"/>
+            <w:tcMar>
+              <w:top w:w="60" w:type="dxa"/>
+              <w:left w:w="100" w:type="dxa"/>
+              <w:bottom w:w="60" w:type="dxa"/>
+              <w:right w:w="100" w:type="dxa"/>
+            </w:tcMar>
+          </w:tcPr>
+          <w:p>
+            <w:pPr>
+              <w:spacing w:after="20" w:line="252" w:lineRule="auto"/>
+            </w:pPr>
+            <w:r>
+              <w:rPr>
+                <w:sz w:val="19"/>
+                <w:szCs w:val="19"/>
+              </w:rPr>
+              <w:t>Links are Google Maps "near me" searches opening in a new tab with noopener/noreferrer; no location request on page load; one request only after "Use my location"; links then centre on the position; the position never reached the API; nothing written to localStorage.</w:t>
+            </w:r>
+          </w:p>
+        </w:tc>
+      </w:tr>
+      <w:tr>
+        <w:tc>
+          <w:tcPr>
+            <w:tcW w:w="2700" w:type="dxa"/>
+            <w:tcBorders>
+              <w:top w:val="single" w:sz="4" w:space="0" w:color="D9CFE8"/>
+              <w:left w:val="single" w:sz="4" w:space="0" w:color="D9CFE8"/>
+              <w:bottom w:val="single" w:sz="4" w:space="0" w:color="D9CFE8"/>
+              <w:right w:val="single" w:sz="4" w:space="0" w:color="D9CFE8"/>
+            </w:tcBorders>
+            <w:tcMar>
+              <w:top w:w="60" w:type="dxa"/>
+              <w:left w:w="100" w:type="dxa"/>
+              <w:bottom w:w="60" w:type="dxa"/>
+              <w:right w:w="100" w:type="dxa"/>
+            </w:tcMar>
+          </w:tcPr>
+          <w:p>
+            <w:pPr>
+              <w:spacing w:after="20" w:line="252" w:lineRule="auto"/>
+            </w:pPr>
+            <w:r>
+              <w:rPr>
+                <w:sz w:val="19"/>
+                <w:szCs w:val="19"/>
+              </w:rPr>
+              <w:t>3. Onboarding checklist</w:t>
+            </w:r>
+          </w:p>
+        </w:tc>
+        <w:tc>
+          <w:tcPr>
+            <w:tcW w:w="6938" w:type="dxa"/>
+            <w:tcBorders>
+              <w:top w:val="single" w:sz="4" w:space="0" w:color="D9CFE8"/>
+              <w:left w:val="single" w:sz="4" w:space="0" w:color="D9CFE8"/>
+              <w:bottom w:val="single" w:sz="4" w:space="0" w:color="D9CFE8"/>
+              <w:right w:val="single" w:sz="4" w:space="0" w:color="D9CFE8"/>
+            </w:tcBorders>
+            <w:tcMar>
+              <w:top w:w="60" w:type="dxa"/>
+              <w:left w:w="100" w:type="dxa"/>
+              <w:bottom w:w="60" w:type="dxa"/>
+              <w:right w:w="100" w:type="dxa"/>
+            </w:tcMar>
+          </w:tcPr>
+          <w:p>
+            <w:pPr>
+              <w:spacing w:after="20" w:line="252" w:lineRule="auto"/>
+            </w:pPr>
+            <w:r>
+              <w:rPr>
+                <w:sz w:val="19"/>
+                <w:szCs w:val="19"/>
+              </w:rPr>
+              <w:t xml:space="preserve">Shown for a new user (0 / 3); adding a contact ticks step 1 live; verifying ticks step 2; the drill ticks step 3 and the card hides; stays hidden after reload; a fully set-up user never sees it; a verified contact without consent does not count; if the contact list fails to load the card stays hidden. Backend: </w:t>
+            </w:r>
+            <w:r>
+              <w:rPr>
+                <w:rFonts w:ascii="Consolas" w:eastAsia="Consolas" w:hAnsi="Consolas" w:cs="Consolas"/>
+                <w:sz w:val="19"/>
+                <w:szCs w:val="19"/>
+              </w:rPr>
+              <w:t>UserApiTest</w:t>
+            </w:r>
+            <w:r>
+              <w:rPr>
+                <w:sz w:val="19"/>
+                <w:szCs w:val="19"/>
+              </w:rPr>
+              <w:t xml:space="preserve"> covers the profile flag.</w:t>
+            </w:r>
+          </w:p>
+        </w:tc>
+      </w:tr>
+      <w:tr>
+        <w:tc>
+          <w:tcPr>
+            <w:tcW w:w="2700" w:type="dxa"/>
+            <w:tcBorders>
+              <w:top w:val="single" w:sz="4" w:space="0" w:color="D9CFE8"/>
+              <w:left w:val="single" w:sz="4" w:space="0" w:color="D9CFE8"/>
+              <w:bottom w:val="single" w:sz="4" w:space="0" w:color="D9CFE8"/>
+              <w:right w:val="single" w:sz="4" w:space="0" w:color="D9CFE8"/>
+            </w:tcBorders>
+            <w:shd w:val="clear" w:color="auto" w:fill="FAF7FD"/>
+            <w:tcMar>
+              <w:top w:w="60" w:type="dxa"/>
+              <w:left w:w="100" w:type="dxa"/>
+              <w:bottom w:w="60" w:type="dxa"/>
+              <w:right w:w="100" w:type="dxa"/>
+            </w:tcMar>
+          </w:tcPr>
+          <w:p>
+            <w:pPr>
+              <w:spacing w:after="20" w:line="252" w:lineRule="auto"/>
+            </w:pPr>
+            <w:r>
+              <w:rPr>
+                <w:sz w:val="19"/>
+                <w:szCs w:val="19"/>
+              </w:rPr>
+              <w:t>4. SOS drill</w:t>
+            </w:r>
+          </w:p>
+        </w:tc>
+        <w:tc>
+          <w:tcPr>
+            <w:tcW w:w="6938" w:type="dxa"/>
+            <w:tcBorders>
+              <w:top w:val="single" w:sz="4" w:space="0" w:color="D9CFE8"/>
+              <w:left w:val="single" w:sz="4" w:space="0" w:color="D9CFE8"/>
+              <w:bottom w:val="single" w:sz="4" w:space="0" w:color="D9CFE8"/>
+              <w:right w:val="single" w:sz="4" w:space="0" w:color="D9CFE8"/>
+            </w:tcBorders>
+            <w:shd w:val="clear" w:color="auto" w:fill="FAF7FD"/>
+            <w:tcMar>
+              <w:top w:w="60" w:type="dxa"/>
+              <w:left w:w="100" w:type="dxa"/>
+              <w:bottom w:w="60" w:type="dxa"/>
+              <w:right w:w="100" w:type="dxa"/>
+            </w:tcMar>
+          </w:tcPr>
+          <w:p>
+            <w:pPr>
+              <w:spacing w:after="20" w:line="252" w:lineRule="auto"/>
+            </w:pPr>
+            <w:r>
+              <w:rPr>
+                <w:sz w:val="19"/>
+                <w:szCs w:val="19"/>
+              </w:rPr>
+              <w:t>Opens from the checklist and from the SOS card; PRACTICE ONLY banner; no tel: link inside; emergency number shown as text; names who a real SOS would message; no request to /api/sos and no alert created in every drill run (including with the location check and when saving the flag fails); location check only when ticked and never sent; honest message when the flag cannot be saved; the drill module contains no alert-API call (source check).</w:t>
+            </w:r>
+          </w:p>
+        </w:tc>
+      </w:tr>
+      <w:tr>
+        <w:tc>
+          <w:tcPr>
+            <w:tcW w:w="2700" w:type="dxa"/>
+            <w:tcBorders>
+              <w:top w:val="single" w:sz="4" w:space="0" w:color="D9CFE8"/>
+              <w:left w:val="single" w:sz="4" w:space="0" w:color="D9CFE8"/>
+              <w:bottom w:val="single" w:sz="4" w:space="0" w:color="D9CFE8"/>
+              <w:right w:val="single" w:sz="4" w:space="0" w:color="D9CFE8"/>
+            </w:tcBorders>
+            <w:tcMar>
+              <w:top w:w="60" w:type="dxa"/>
+              <w:left w:w="100" w:type="dxa"/>
+              <w:bottom w:w="60" w:type="dxa"/>
+              <w:right w:w="100" w:type="dxa"/>
+            </w:tcMar>
+          </w:tcPr>
+          <w:p>
+            <w:pPr>
+              <w:spacing w:after="20" w:line="252" w:lineRule="auto"/>
+            </w:pPr>
+            <w:r>
+              <w:rPr>
+                <w:sz w:val="19"/>
+                <w:szCs w:val="19"/>
+              </w:rPr>
+              <w:t>5. Landing page and root redirect</w:t>
+            </w:r>
+          </w:p>
+        </w:tc>
+        <w:tc>
+          <w:tcPr>
+            <w:tcW w:w="6938" w:type="dxa"/>
+            <w:tcBorders>
+              <w:top w:val="single" w:sz="4" w:space="0" w:color="D9CFE8"/>
+              <w:left w:val="single" w:sz="4" w:space="0" w:color="D9CFE8"/>
+              <w:bottom w:val="single" w:sz="4" w:space="0" w:color="D9CFE8"/>
+              <w:right w:val="single" w:sz="4" w:space="0" w:color="D9CFE8"/>
+            </w:tcBorders>
+            <w:tcMar>
+              <w:top w:w="60" w:type="dxa"/>
+              <w:left w:w="100" w:type="dxa"/>
+              <w:bottom w:w="60" w:type="dxa"/>
+              <w:right w:w="100" w:type="dxa"/>
+            </w:tcMar>
+          </w:tcPr>
+          <w:p>
+            <w:pPr>
+              <w:spacing w:after="20" w:line="252" w:lineRule="auto"/>
+            </w:pPr>
+            <w:r>
+              <w:rPr>
+                <w:sz w:val="19"/>
+                <w:szCs w:val="19"/>
+              </w:rPr>
+              <w:t xml:space="preserve">Root opens </w:t>
+            </w:r>
+            <w:r>
+              <w:rPr>
+                <w:rFonts w:ascii="Consolas" w:eastAsia="Consolas" w:hAnsi="Consolas" w:cs="Consolas"/>
+                <w:sz w:val="19"/>
+                <w:szCs w:val="19"/>
+              </w:rPr>
+              <w:t>frontend/home.html</w:t>
+            </w:r>
+            <w:r>
+              <w:rPr>
+                <w:sz w:val="19"/>
+                <w:szCs w:val="19"/>
+              </w:rPr>
+              <w:t xml:space="preserve"> on localhost (from 127.0.0.1); "is / is not" lists, 3 steps, helplines, FAQ; says not an emergency service and never contacts the police; explains test mode; all linked pages return 200; no API call and no location request; no horizontal scroll at 1440/768/390.</w:t>
+            </w:r>
+          </w:p>
+        </w:tc>
+      </w:tr>
+      <w:tr>
+        <w:tc>
+          <w:tcPr>
+            <w:tcW w:w="2700" w:type="dxa"/>
+            <w:tcBorders>
+              <w:top w:val="single" w:sz="4" w:space="0" w:color="D9CFE8"/>
+              <w:left w:val="single" w:sz="4" w:space="0" w:color="D9CFE8"/>
+              <w:bottom w:val="single" w:sz="4" w:space="0" w:color="D9CFE8"/>
+              <w:right w:val="single" w:sz="4" w:space="0" w:color="D9CFE8"/>
+            </w:tcBorders>
+            <w:shd w:val="clear" w:color="auto" w:fill="FAF7FD"/>
+            <w:tcMar>
+              <w:top w:w="60" w:type="dxa"/>
+              <w:left w:w="100" w:type="dxa"/>
+              <w:bottom w:w="60" w:type="dxa"/>
+              <w:right w:w="100" w:type="dxa"/>
+            </w:tcMar>
+          </w:tcPr>
+          <w:p>
+            <w:pPr>
+              <w:spacing w:after="20" w:line="252" w:lineRule="auto"/>
+            </w:pPr>
+            <w:r>
+              <w:rPr>
+                <w:sz w:val="19"/>
+                <w:szCs w:val="19"/>
+              </w:rPr>
+              <w:t>6. Help page and 404</w:t>
+            </w:r>
+          </w:p>
+        </w:tc>
+        <w:tc>
+          <w:tcPr>
+            <w:tcW w:w="6938" w:type="dxa"/>
+            <w:tcBorders>
+              <w:top w:val="single" w:sz="4" w:space="0" w:color="D9CFE8"/>
+              <w:left w:val="single" w:sz="4" w:space="0" w:color="D9CFE8"/>
+              <w:bottom w:val="single" w:sz="4" w:space="0" w:color="D9CFE8"/>
+              <w:right w:val="single" w:sz="4" w:space="0" w:color="D9CFE8"/>
+            </w:tcBorders>
+            <w:shd w:val="clear" w:color="auto" w:fill="FAF7FD"/>
+            <w:tcMar>
+              <w:top w:w="60" w:type="dxa"/>
+              <w:left w:w="100" w:type="dxa"/>
+              <w:bottom w:w="60" w:type="dxa"/>
+              <w:right w:w="100" w:type="dxa"/>
+            </w:tcMar>
+          </w:tcPr>
+          <w:p>
+            <w:pPr>
+              <w:spacing w:after="20" w:line="252" w:lineRule="auto"/>
+            </w:pPr>
+            <w:r>
+              <w:rPr>
+                <w:sz w:val="19"/>
+                <w:szCs w:val="19"/>
+              </w:rPr>
+              <w:t>Help: at least 15 questions incl. drill, test mode, verification, location, statuses, sign-in problems; says account deletion is not available yet. 404: served for unknown paths at three URL depths with working links, logo and styles; responsive at 1440/768/390.</w:t>
+            </w:r>
+          </w:p>
+        </w:tc>
+      </w:tr>
+    </w:tbl>
+    <w:p>
+      <w:pPr>
+        <w:pStyle w:val="Heading1"/>
+        <w:pageBreakBefore/>
+      </w:pPr>
+      <w:bookmarkStart w:id="37" w:name="_Toc243775131"/>
+      <w:r>
+        <w:t>12. Open items and limitations</w:t>
+      </w:r>
+      <w:bookmarkEnd w:id="37"/>
+    </w:p>
+    <w:p>
+      <w:pPr>
+        <w:pStyle w:val="Heading2"/>
+      </w:pPr>
+      <w:bookmarkStart w:id="38" w:name="_Toc243775132"/>
+      <w:r>
+        <w:t>12.1 Open issue</w:t>
+      </w:r>
+      <w:bookmarkEnd w:id="38"/>
+    </w:p>
+    <w:p>
+      <w:pPr>
+        <w:pBdr>
+          <w:left w:val="single" w:sz="18" w:space="8" w:color="D9A441"/>
+        </w:pBdr>
+        <w:shd w:val="clear" w:color="auto" w:fill="FFF6E3"/>
+        <w:spacing w:before="80" w:after="160" w:line="264" w:lineRule="auto"/>
+        <w:ind w:left="160" w:right="160"/>
+      </w:pPr>
+      <w:r>
+        <w:rPr>
+          <w:b/>
+          <w:bCs/>
+          <w:color w:val="6B4700"/>
+        </w:rPr>
+        <w:t>Sign-in failure reported on 24 Oct 2026:</w:t>
+      </w:r>
+      <w:r>
+        <w:rPr>
+          <w:color w:val="6B4700"/>
+        </w:rPr>
+        <w:t xml:space="preserve"> after "Send code" the login page showed "Something went wrong while signing you in". The backend logged no errors and Firebase answered normally from localhost in a headless check, which could not get past Google's reCAPTCHA picture check. The page now shows the Firebase error code; the cause is still unknown until the next attempt in a normal browser (Ctrl+F5 first).</w:t>
+      </w:r>
+    </w:p>
+    <w:p>
+      <w:pPr>
+        <w:pStyle w:val="Heading2"/>
+      </w:pPr>
+      <w:bookmarkStart w:id="39" w:name="_Toc243775133"/>
+      <w:r>
+        <w:t>12.2 Phase 1: still unverified</w:t>
+      </w:r>
+      <w:bookmarkEnd w:id="39"/>
     </w:p>
     <w:p>
       <w:pPr>
@@ -19864,63 +20752,120 @@
         <w:spacing w:after="60" w:line="264" w:lineRule="auto"/>
       </w:pPr>
       <w:r>
-        <w:t>Verification dialog no longer repeats the TEST MODE message (22 Oct, after the last UI run).</w:t>
-      </w:r>
-    </w:p>
-    <w:p>
-      <w:pPr>
-        <w:pStyle w:val="Heading1"/>
-        <w:pageBreakBefore/>
-      </w:pPr>
-      <w:bookmarkStart w:id="36" w:name="_Toc243772841"/>
-      <w:r>
-        <w:t>12. Open items and limitations</w:t>
-      </w:r>
-      <w:bookmarkEnd w:id="36"/>
-    </w:p>
-    <w:p>
-      <w:pPr>
-        <w:pStyle w:val="Heading2"/>
-      </w:pPr>
-      <w:bookmarkStart w:id="37" w:name="_Toc243772842"/>
-      <w:r>
-        <w:t>12.1 Open issue</w:t>
-      </w:r>
-      <w:bookmarkEnd w:id="37"/>
-    </w:p>
-    <w:p>
-      <w:pPr>
-        <w:pBdr>
-          <w:left w:val="single" w:sz="18" w:space="8" w:color="D9A441"/>
-        </w:pBdr>
-        <w:shd w:val="clear" w:color="auto" w:fill="FFF6E3"/>
-        <w:spacing w:before="80" w:after="160" w:line="264" w:lineRule="auto"/>
-        <w:ind w:left="160" w:right="160"/>
-      </w:pPr>
-      <w:r>
         <w:rPr>
           <w:b/>
           <w:bCs/>
-          <w:color w:val="6B4700"/>
         </w:rPr>
-        <w:t>Sign-in failure reported on 24 Oct 2026:</w:t>
+        <w:t>Nothing from phase 1 has been tried against the real backend and Firebase with a signed-in user.</w:t>
+      </w:r>
+      <w:r>
+        <w:t xml:space="preserve"> The drill endpoint exists in the running backend (it answers 401 without a token), but the full flow — sign in, finish a drill, see the checklist tick — has only run against the mock API.</w:t>
+      </w:r>
+    </w:p>
+    <w:p>
+      <w:pPr>
+        <w:pStyle w:val="ListParagraph"/>
+        <w:numPr>
+          <w:ilvl w:val="0"/>
+          <w:numId w:val="4"/>
+        </w:numPr>
+        <w:spacing w:after="60" w:line="264" w:lineRule="auto"/>
+      </w:pPr>
+      <w:r>
+        <w:t>Helpline numbers and descriptions come from public information and were not checked with each service; routing differs between states (in several states 100 and 1091 are answered through 112). Review them before a public launch.</w:t>
+      </w:r>
+    </w:p>
+    <w:p>
+      <w:pPr>
+        <w:pStyle w:val="ListParagraph"/>
+        <w:numPr>
+          <w:ilvl w:val="0"/>
+          <w:numId w:val="4"/>
+        </w:numPr>
+        <w:spacing w:after="60" w:line="264" w:lineRule="auto"/>
+      </w:pPr>
+      <w:r>
+        <w:t xml:space="preserve">The "Use my location" link format </w:t>
       </w:r>
       <w:r>
         <w:rPr>
-          <w:color w:val="6B4700"/>
+          <w:rFonts w:ascii="Consolas" w:eastAsia="Consolas" w:hAnsi="Consolas" w:cs="Consolas"/>
+          <w:color w:val="4A2470"/>
+          <w:sz w:val="19"/>
+          <w:szCs w:val="19"/>
         </w:rPr>
-        <w:t xml:space="preserve"> after "Send code" the login page showed "Something went wrong while signing you in". The backend logged no errors and Firebase answered normally from localhost in a headless check, which could not get past Google's reCAPTCHA picture check. The page now shows the Firebase error code; the cause is still unknown until the next attempt in a normal browser (Ctrl+F5 first).</w:t>
+        <w:t>google.com/maps/search/&lt;query&gt;/@lat,lng,15z</w:t>
+      </w:r>
+      <w:r>
+        <w:t xml:space="preserve"> works today but is not part of Google's documented Maps URLs API and could change. The default "near me" links use the documented format.</w:t>
+      </w:r>
+    </w:p>
+    <w:p>
+      <w:pPr>
+        <w:pStyle w:val="ListParagraph"/>
+        <w:numPr>
+          <w:ilvl w:val="0"/>
+          <w:numId w:val="4"/>
+        </w:numPr>
+        <w:spacing w:after="60" w:line="264" w:lineRule="auto"/>
+      </w:pPr>
+      <w:r>
+        <w:rPr>
+          <w:rFonts w:ascii="Consolas" w:eastAsia="Consolas" w:hAnsi="Consolas" w:cs="Consolas"/>
+          <w:color w:val="4A2470"/>
+          <w:sz w:val="19"/>
+          <w:szCs w:val="19"/>
+        </w:rPr>
+        <w:t>404.html</w:t>
+      </w:r>
+      <w:r>
+        <w:t xml:space="preserve"> is used automatically only by static hosts such as Firebase Hosting; VS Code Live Server shows its own page. The 404 behaviour was checked with the test server, not on a real host.</w:t>
+      </w:r>
+    </w:p>
+    <w:p>
+      <w:pPr>
+        <w:pStyle w:val="ListParagraph"/>
+        <w:numPr>
+          <w:ilvl w:val="0"/>
+          <w:numId w:val="4"/>
+        </w:numPr>
+        <w:spacing w:after="60" w:line="264" w:lineRule="auto"/>
+      </w:pPr>
+      <w:r>
+        <w:t>No real phone or tablet was used; layout was checked in headless Edge at 1440 / 768 / 390 px.</w:t>
+      </w:r>
+    </w:p>
+    <w:p>
+      <w:pPr>
+        <w:pStyle w:val="ListParagraph"/>
+        <w:numPr>
+          <w:ilvl w:val="0"/>
+          <w:numId w:val="4"/>
+        </w:numPr>
+        <w:spacing w:after="60" w:line="264" w:lineRule="auto"/>
+      </w:pPr>
+      <w:r>
+        <w:rPr>
+          <w:rFonts w:ascii="Consolas" w:eastAsia="Consolas" w:hAnsi="Consolas" w:cs="Consolas"/>
+          <w:color w:val="4A2470"/>
+          <w:sz w:val="19"/>
+          <w:szCs w:val="19"/>
+        </w:rPr>
+        <w:t>terms.html</w:t>
+      </w:r>
+      <w:r>
+        <w:t xml:space="preserve"> still says an SOS "does not notify your contacts" and names 112 in the legal text. That matches TEST mode but not REAL mode, and the legal text is outside the config-driven helplines. It needs updating with the legal review.</w:t>
       </w:r>
     </w:p>
     <w:p>
       <w:pPr>
         <w:pStyle w:val="Heading2"/>
       </w:pPr>
-      <w:bookmarkStart w:id="38" w:name="_Toc243772843"/>
-      <w:r>
-        <w:t>12.2 Not done / needs external setup</w:t>
-      </w:r>
-      <w:bookmarkEnd w:id="38"/>
+      <w:bookmarkStart w:id="40" w:name="_Toc243775134"/>
+      <w:r>
+        <w:t>12.3 Not done / needs external setup</w:t>
+      </w:r>
+      <w:bookmarkEnd w:id="40"/>
     </w:p>
     <w:p>
       <w:pPr>
@@ -19984,7 +20929,7 @@
         <w:spacing w:after="60" w:line="264" w:lineRule="auto"/>
       </w:pPr>
       <w:r>
-        <w:t>No handling of inbound SMS replies (for example STOP / opt-out).</w:t>
+        <w:t>No handling of inbound SMS replies (for example STOP / opt-out). No in-app account deletion.</w:t>
       </w:r>
     </w:p>
     <w:p>
@@ -20015,6 +20960,16 @@
     </w:p>
     <w:p>
       <w:pPr>
+        <w:pStyle w:val="Heading2"/>
+      </w:pPr>
+      <w:bookmarkStart w:id="41" w:name="_Toc243775135"/>
+      <w:r>
+        <w:t>12.4 Known limitations</w:t>
+      </w:r>
+      <w:bookmarkEnd w:id="41"/>
+    </w:p>
+    <w:p>
+      <w:pPr>
         <w:pStyle w:val="ListParagraph"/>
         <w:numPr>
           <w:ilvl w:val="0"/>
@@ -20023,18 +20978,8 @@
         <w:spacing w:after="60" w:line="264" w:lineRule="auto"/>
       </w:pPr>
       <w:r>
-        <w:t>The project folder is not a Git repository; nothing has been committed. (Agreed working rule: a new branch for every change, never pushing to main.)</w:t>
-      </w:r>
-    </w:p>
-    <w:p>
-      <w:pPr>
-        <w:pStyle w:val="Heading2"/>
-      </w:pPr>
-      <w:bookmarkStart w:id="39" w:name="_Toc243772844"/>
-      <w:r>
-        <w:t>12.3 Known limitations</w:t>
-      </w:r>
-      <w:bookmarkEnd w:id="39"/>
+        <w:t>Rate limits and live-stream subscribers are kept in one server's memory; with several servers each has its own (the console also polls).</w:t>
+      </w:r>
     </w:p>
     <w:p>
       <w:pPr>
@@ -20046,7 +20991,7 @@
         <w:spacing w:after="60" w:line="264" w:lineRule="auto"/>
       </w:pPr>
       <w:r>
-        <w:t>Rate limits and live-stream subscribers are kept in one server's memory; with several servers each has its own (the console also polls).</w:t>
+        <w:t>Admin search and filters scan the newest records in memory (500 users, 1,000 alerts, 500 audit entries, 5,000 for reports); large datasets need indexed queries.</w:t>
       </w:r>
     </w:p>
     <w:p>
@@ -20059,7 +21004,7 @@
         <w:spacing w:after="60" w:line="264" w:lineRule="auto"/>
       </w:pPr>
       <w:r>
-        <w:t>Admin search and filters scan the newest records in memory (500 users, 1,000 alerts, 500 audit entries, 5,000 for reports); large datasets need indexed queries.</w:t>
+        <w:t>Notification delivery is at-least-once; a crash at the wrong moment can send one SMS twice.</w:t>
       </w:r>
     </w:p>
     <w:p>
@@ -20072,7 +21017,7 @@
         <w:spacing w:after="60" w:line="264" w:lineRule="auto"/>
       </w:pPr>
       <w:r>
-        <w:t>Notification delivery is at-least-once; a crash at the wrong moment can send one SMS twice.</w:t>
+        <w:t>The retention purge reads up to 500 expired alerts per run; a backlog of more than 500 still-open expired alerts would delay the purge of closed ones.</w:t>
       </w:r>
     </w:p>
     <w:p>
@@ -20085,7 +21030,7 @@
         <w:spacing w:after="60" w:line="264" w:lineRule="auto"/>
       </w:pPr>
       <w:r>
-        <w:t>The retention purge reads up to 500 expired alerts per run; a backlog of more than 500 still-open expired alerts would delay the purge of closed ones.</w:t>
+        <w:t>The admin dashboard takes about 7 seconds to load, mainly Firestore latency from this machine.</w:t>
       </w:r>
     </w:p>
     <w:p>
@@ -20098,8 +21043,18 @@
         <w:spacing w:after="60" w:line="264" w:lineRule="auto"/>
       </w:pPr>
       <w:r>
-        <w:t>The admin dashboard takes about 7 seconds to load, mainly Firestore latency from this machine.</w:t>
-      </w:r>
+        <w:t>One older user record ("Akshaya…") has missing fields and is counted differently on the dashboard.</w:t>
+      </w:r>
+    </w:p>
+    <w:p>
+      <w:pPr>
+        <w:pStyle w:val="Heading2"/>
+      </w:pPr>
+      <w:bookmarkStart w:id="42" w:name="_Toc243775136"/>
+      <w:r>
+        <w:t>12.5 Repository and housekeeping</w:t>
+      </w:r>
+      <w:bookmarkEnd w:id="42"/>
     </w:p>
     <w:p>
       <w:pPr>
@@ -20111,18 +21066,44 @@
         <w:spacing w:after="60" w:line="264" w:lineRule="auto"/>
       </w:pPr>
       <w:r>
-        <w:t>One older user record ("Akshaya…") has missing fields and is counted differently on the dashboard.</w:t>
-      </w:r>
-    </w:p>
-    <w:p>
-      <w:pPr>
-        <w:pStyle w:val="Heading2"/>
-      </w:pPr>
-      <w:bookmarkStart w:id="40" w:name="_Toc243772845"/>
-      <w:r>
-        <w:t>12.4 Housekeeping</w:t>
-      </w:r>
-      <w:bookmarkEnd w:id="40"/>
+        <w:t xml:space="preserve">The project folder is now a local Git repository. All work is on the branch </w:t>
+      </w:r>
+      <w:r>
+        <w:rPr>
+          <w:rFonts w:ascii="Consolas" w:eastAsia="Consolas" w:hAnsi="Consolas" w:cs="Consolas"/>
+          <w:color w:val="4A2470"/>
+          <w:sz w:val="19"/>
+          <w:szCs w:val="19"/>
+        </w:rPr>
+        <w:t>feature/phase1-pages</w:t>
+      </w:r>
+      <w:r>
+        <w:t xml:space="preserve">: a baseline commit of the existing project, then one commit per phase 1 item and one for the UI suite. There is no </w:t>
+      </w:r>
+      <w:r>
+        <w:rPr>
+          <w:rFonts w:ascii="Consolas" w:eastAsia="Consolas" w:hAnsi="Consolas" w:cs="Consolas"/>
+          <w:color w:val="4A2470"/>
+          <w:sz w:val="19"/>
+          <w:szCs w:val="19"/>
+        </w:rPr>
+        <w:t>main</w:t>
+      </w:r>
+      <w:r>
+        <w:t xml:space="preserve"> branch and nothing has been pushed. </w:t>
+      </w:r>
+      <w:r>
+        <w:rPr>
+          <w:rFonts w:ascii="Consolas" w:eastAsia="Consolas" w:hAnsi="Consolas" w:cs="Consolas"/>
+          <w:color w:val="4A2470"/>
+          <w:sz w:val="19"/>
+          <w:szCs w:val="19"/>
+        </w:rPr>
+        <w:t>women_safetyApp/</w:t>
+      </w:r>
+      <w:r>
+        <w:t xml:space="preserve"> (a separate clone of github.com/Chella001/women_safetyApp) is ignored.</w:t>
+      </w:r>
     </w:p>
     <w:p>
       <w:pPr>
@@ -20134,7 +21115,7 @@
         <w:spacing w:after="60" w:line="264" w:lineRule="auto"/>
       </w:pPr>
       <w:r>
-        <w:t>Test data left in Firestore by the interrupted SOS run of 22 Oct: several test alerts and the contacts "Test Mum" / "Test Dad" on the administrator account. A cleanup script that removes only these was prepared but not yet run.</w:t>
+        <w:t>Test data left in Firestore by the interrupted SOS run of 22 Oct: several test alerts and the contacts "Test Mum" / "Test Dad" on the administrator account. The cleanup script for it was in the temporary folder that was cleared, so it would need to be rewritten before removing that data.</w:t>
       </w:r>
     </w:p>
     <w:p>
@@ -20167,21 +21148,21 @@
         <w:pStyle w:val="Heading1"/>
         <w:pageBreakBefore/>
       </w:pPr>
-      <w:bookmarkStart w:id="41" w:name="_Toc243772846"/>
+      <w:bookmarkStart w:id="43" w:name="_Toc243775137"/>
       <w:r>
         <w:t>Appendix — complete file inventory</w:t>
       </w:r>
-      <w:bookmarkEnd w:id="41"/>
+      <w:bookmarkEnd w:id="43"/>
     </w:p>
     <w:p>
       <w:pPr>
         <w:pStyle w:val="Heading2"/>
       </w:pPr>
-      <w:bookmarkStart w:id="42" w:name="_Toc243772847"/>
+      <w:bookmarkStart w:id="44" w:name="_Toc243775138"/>
       <w:r>
         <w:t>Backend: main source (backend/src/main/java/com/womensafety)</w:t>
       </w:r>
-      <w:bookmarkEnd w:id="42"/>
+      <w:bookmarkEnd w:id="44"/>
     </w:p>
     <w:tbl>
       <w:tblPr>
@@ -20953,11 +21934,11 @@
       <w:pPr>
         <w:pStyle w:val="Heading2"/>
       </w:pPr>
-      <w:bookmarkStart w:id="43" w:name="_Toc243772848"/>
+      <w:bookmarkStart w:id="45" w:name="_Toc243775139"/>
       <w:r>
         <w:t>Backend: tests (backend/src/test)</w:t>
       </w:r>
-      <w:bookmarkEnd w:id="43"/>
+      <w:bookmarkEnd w:id="45"/>
     </w:p>
     <w:p>
       <w:pPr>
@@ -20983,11 +21964,11 @@
       <w:pPr>
         <w:pStyle w:val="Heading2"/>
       </w:pPr>
-      <w:bookmarkStart w:id="44" w:name="_Toc243772849"/>
+      <w:bookmarkStart w:id="46" w:name="_Toc243775140"/>
       <w:r>
         <w:t>Backend: other</w:t>
       </w:r>
-      <w:bookmarkEnd w:id="44"/>
+      <w:bookmarkEnd w:id="46"/>
     </w:p>
     <w:p>
       <w:pPr>
@@ -21034,11 +22015,11 @@
       <w:pPr>
         <w:pStyle w:val="Heading2"/>
       </w:pPr>
-      <w:bookmarkStart w:id="45" w:name="_Toc243772850"/>
+      <w:bookmarkStart w:id="47" w:name="_Toc243775141"/>
       <w:r>
         <w:t>Frontend (frontend/)</w:t>
       </w:r>
-      <w:bookmarkEnd w:id="45"/>
+      <w:bookmarkEnd w:id="47"/>
     </w:p>
     <w:tbl>
       <w:tblPr>
@@ -21377,11 +22358,11 @@
       <w:pPr>
         <w:pStyle w:val="Heading2"/>
       </w:pPr>
-      <w:bookmarkStart w:id="46" w:name="_Toc243772851"/>
+      <w:bookmarkStart w:id="48" w:name="_Toc243775142"/>
       <w:r>
         <w:t>Project root</w:t>
       </w:r>
-      <w:bookmarkEnd w:id="46"/>
+      <w:bookmarkEnd w:id="48"/>
     </w:p>
     <w:p>
       <w:pPr>
@@ -21666,10 +22647,96 @@
 <file path=word/numbering.xml><?xml version="1.0" encoding="utf-8"?>
 <w:numbering xmlns:wpc="http://schemas.microsoft.com/office/word/2010/wordprocessingCanvas" xmlns:cx="http://schemas.microsoft.com/office/drawing/2014/chartex" xmlns:cx1="http://schemas.microsoft.com/office/drawing/2015/9/8/chartex" xmlns:cx2="http://schemas.microsoft.com/office/drawing/2015/10/21/chartex" xmlns:cx3="http://schemas.microsoft.com/office/drawing/2016/5/9/chartex" xmlns:cx4="http://schemas.microsoft.com/office/drawing/2016/5/10/chartex" xmlns:cx5="http://schemas.microsoft.com/office/drawing/2016/5/11/chartex" xmlns:cx6="http://schemas.microsoft.com/office/drawing/2016/5/12/chartex" xmlns:cx7="http://schemas.microsoft.com/office/drawing/2016/5/13/chartex" xmlns:cx8="http://schemas.microsoft.com/office/drawing/2016/5/14/chartex" xmlns:mc="http://schemas.openxmlformats.org/markup-compatibility/2006" xmlns:aink="http://schemas.microsoft.com/office/drawing/2016/ink" xmlns:am3d="http://schemas.microsoft.com/office/drawing/2017/model3d" xmlns:o="urn:schemas-microsoft-com:office:office" xmlns:oel="http://schemas.microsoft.com/office/2019/extlst" xmlns:r="http://schemas.openxmlformats.org/officeDocument/2006/relationships" xmlns:m="http://schemas.openxmlformats.org/officeDocument/2006/math" xmlns:v="urn:schemas-microsoft-com:vml" xmlns:wp14="http://schemas.microsoft.com/office/word/2010/wordprocessingDrawing" xmlns:wp="http://schemas.openxmlformats.org/drawingml/2006/wordprocessingDrawing" xmlns:w10="urn:schemas-microsoft-com:office:word" xmlns:w="http://schemas.openxmlformats.org/wordprocessingml/2006/main" xmlns:w14="http://schemas.microsoft.com/office/word/2010/wordml" xmlns:w15="http://schemas.microsoft.com/office/word/2012/wordml" xmlns:w16cex="http://schemas.microsoft.com/office/word/2018/wordml/cex" xmlns:w16cid="http://schemas.microsoft.com/office/word/2016/wordml/cid" xmlns:w16="http://schemas.microsoft.com/office/word/2018/wordml" xmlns:w16du="http://schemas.microsoft.com/office/word/2023/wordml/word16du" xmlns:w16sdtdh="http://schemas.microsoft.com/office/word/2020/wordml/sdtdatahash" xmlns:w16sdtfl="http://schemas.microsoft.com/office/word/2024/wordml/sdtformatlock" xmlns:w16se="http://schemas.microsoft.com/office/word/2015/wordml/symex" xmlns:wpg="http://schemas.microsoft.com/office/word/2010/wordprocessingGroup" xmlns:wpi="http://schemas.microsoft.com/office/word/2010/wordprocessingInk" xmlns:wne="http://schemas.microsoft.com/office/word/2006/wordml" xmlns:wps="http://schemas.microsoft.com/office/word/2010/wordprocessingShape" mc:Ignorable="w14 w15 w16se w16cid w16 w16cex w16sdtdh w16sdtfl w16du wp14">
   <w:abstractNum w:abstractNumId="0" w15:restartNumberingAfterBreak="0">
-    <w:nsid w:val="28EB7DD4"/>
+    <w:nsid w:val="074065C1"/>
     <w:multiLevelType w:val="hybridMultilevel"/>
-    <w:tmpl w:val="0A747C30"/>
-    <w:lvl w:ilvl="0" w:tplc="9FB46504">
+    <w:tmpl w:val="836C6D32"/>
+    <w:lvl w:ilvl="0" w:tplc="91644724" w:tentative="1">
+      <w:start w:val="1"/>
+      <w:numFmt w:val="bullet"/>
+      <w:lvlText w:val="●"/>
+      <w:lvlJc w:val="left"/>
+      <w:pPr>
+        <w:ind w:left="720" w:hanging="360"/>
+      </w:pPr>
+    </w:lvl>
+    <w:lvl w:ilvl="1" w:tplc="C432679E" w:tentative="1">
+      <w:start w:val="1"/>
+      <w:numFmt w:val="bullet"/>
+      <w:lvlText w:val="○"/>
+      <w:lvlJc w:val="left"/>
+      <w:pPr>
+        <w:ind w:left="1440" w:hanging="360"/>
+      </w:pPr>
+    </w:lvl>
+    <w:lvl w:ilvl="2" w:tplc="7480C69C" w:tentative="1">
+      <w:start w:val="1"/>
+      <w:numFmt w:val="bullet"/>
+      <w:lvlText w:val="■"/>
+      <w:lvlJc w:val="left"/>
+      <w:pPr>
+        <w:ind w:left="2160" w:hanging="360"/>
+      </w:pPr>
+    </w:lvl>
+    <w:lvl w:ilvl="3" w:tplc="D9485A82" w:tentative="1">
+      <w:start w:val="1"/>
+      <w:numFmt w:val="bullet"/>
+      <w:lvlText w:val="●"/>
+      <w:lvlJc w:val="left"/>
+      <w:pPr>
+        <w:ind w:left="2880" w:hanging="360"/>
+      </w:pPr>
+    </w:lvl>
+    <w:lvl w:ilvl="4" w:tplc="81EE2504" w:tentative="1">
+      <w:start w:val="1"/>
+      <w:numFmt w:val="bullet"/>
+      <w:lvlText w:val="○"/>
+      <w:lvlJc w:val="left"/>
+      <w:pPr>
+        <w:ind w:left="3600" w:hanging="360"/>
+      </w:pPr>
+    </w:lvl>
+    <w:lvl w:ilvl="5" w:tplc="92043B64" w:tentative="1">
+      <w:start w:val="1"/>
+      <w:numFmt w:val="bullet"/>
+      <w:lvlText w:val="■"/>
+      <w:lvlJc w:val="left"/>
+      <w:pPr>
+        <w:ind w:left="4320" w:hanging="360"/>
+      </w:pPr>
+    </w:lvl>
+    <w:lvl w:ilvl="6" w:tplc="D7CC5FE8" w:tentative="1">
+      <w:start w:val="1"/>
+      <w:numFmt w:val="bullet"/>
+      <w:lvlText w:val="●"/>
+      <w:lvlJc w:val="left"/>
+      <w:pPr>
+        <w:ind w:left="5040" w:hanging="360"/>
+      </w:pPr>
+    </w:lvl>
+    <w:lvl w:ilvl="7" w:tplc="ABE4F934" w:tentative="1">
+      <w:start w:val="1"/>
+      <w:numFmt w:val="bullet"/>
+      <w:lvlText w:val="●"/>
+      <w:lvlJc w:val="left"/>
+      <w:pPr>
+        <w:ind w:left="5760" w:hanging="360"/>
+      </w:pPr>
+    </w:lvl>
+    <w:lvl w:ilvl="8" w:tplc="EBB64B8E" w:tentative="1">
+      <w:start w:val="1"/>
+      <w:numFmt w:val="bullet"/>
+      <w:lvlText w:val="●"/>
+      <w:lvlJc w:val="left"/>
+      <w:pPr>
+        <w:ind w:left="6480" w:hanging="360"/>
+      </w:pPr>
+    </w:lvl>
+  </w:abstractNum>
+  <w:abstractNum w:abstractNumId="1" w15:restartNumberingAfterBreak="0">
+    <w:nsid w:val="30254A7C"/>
+    <w:multiLevelType w:val="hybridMultilevel"/>
+    <w:tmpl w:val="86886E04"/>
+    <w:lvl w:ilvl="0" w:tplc="06A67D00" w:tentative="1">
       <w:start w:val="1"/>
       <w:numFmt w:val="decimal"/>
       <w:lvlText w:val="%1."/>
@@ -21678,160 +22745,110 @@
         <w:ind w:left="540" w:hanging="360"/>
       </w:pPr>
     </w:lvl>
-    <w:lvl w:ilvl="1" w:tplc="AF5A8E46">
+    <w:lvl w:ilvl="1" w:tplc="066A8442">
       <w:numFmt w:val="decimal"/>
       <w:lvlText w:val=""/>
       <w:lvlJc w:val="left"/>
     </w:lvl>
-    <w:lvl w:ilvl="2" w:tplc="7B0CF998">
+    <w:lvl w:ilvl="2" w:tplc="817036FC">
       <w:numFmt w:val="decimal"/>
       <w:lvlText w:val=""/>
       <w:lvlJc w:val="left"/>
     </w:lvl>
-    <w:lvl w:ilvl="3" w:tplc="F9167AC4">
+    <w:lvl w:ilvl="3" w:tplc="A93E3614">
       <w:numFmt w:val="decimal"/>
       <w:lvlText w:val=""/>
       <w:lvlJc w:val="left"/>
     </w:lvl>
-    <w:lvl w:ilvl="4" w:tplc="3C32BBFA">
+    <w:lvl w:ilvl="4" w:tplc="EF182D00">
       <w:numFmt w:val="decimal"/>
       <w:lvlText w:val=""/>
       <w:lvlJc w:val="left"/>
     </w:lvl>
-    <w:lvl w:ilvl="5" w:tplc="F0A696EE">
+    <w:lvl w:ilvl="5" w:tplc="E932E788">
       <w:numFmt w:val="decimal"/>
       <w:lvlText w:val=""/>
       <w:lvlJc w:val="left"/>
     </w:lvl>
-    <w:lvl w:ilvl="6" w:tplc="8F10BA1A">
+    <w:lvl w:ilvl="6" w:tplc="E13442FA">
       <w:numFmt w:val="decimal"/>
       <w:lvlText w:val=""/>
       <w:lvlJc w:val="left"/>
     </w:lvl>
-    <w:lvl w:ilvl="7" w:tplc="2D12937E">
+    <w:lvl w:ilvl="7" w:tplc="C06A30A2">
       <w:numFmt w:val="decimal"/>
       <w:lvlText w:val=""/>
       <w:lvlJc w:val="left"/>
     </w:lvl>
-    <w:lvl w:ilvl="8" w:tplc="D3420144">
-      <w:numFmt w:val="decimal"/>
-      <w:lvlText w:val=""/>
-      <w:lvlJc w:val="left"/>
-    </w:lvl>
-  </w:abstractNum>
-  <w:abstractNum w:abstractNumId="1" w15:restartNumberingAfterBreak="0">
-    <w:nsid w:val="29782C06"/>
-    <w:multiLevelType w:val="hybridMultilevel"/>
-    <w:tmpl w:val="18A00D3A"/>
-    <w:lvl w:ilvl="0" w:tplc="BA109E6A">
-      <w:start w:val="1"/>
-      <w:numFmt w:val="decimal"/>
-      <w:lvlText w:val="%1."/>
-      <w:lvlJc w:val="left"/>
-      <w:pPr>
-        <w:ind w:left="540" w:hanging="360"/>
-      </w:pPr>
-    </w:lvl>
-    <w:lvl w:ilvl="1" w:tplc="F2565DA2">
-      <w:numFmt w:val="decimal"/>
-      <w:lvlText w:val=""/>
-      <w:lvlJc w:val="left"/>
-    </w:lvl>
-    <w:lvl w:ilvl="2" w:tplc="6F3CB56E">
-      <w:numFmt w:val="decimal"/>
-      <w:lvlText w:val=""/>
-      <w:lvlJc w:val="left"/>
-    </w:lvl>
-    <w:lvl w:ilvl="3" w:tplc="CBCE1DD8">
-      <w:numFmt w:val="decimal"/>
-      <w:lvlText w:val=""/>
-      <w:lvlJc w:val="left"/>
-    </w:lvl>
-    <w:lvl w:ilvl="4" w:tplc="6044AC34">
-      <w:numFmt w:val="decimal"/>
-      <w:lvlText w:val=""/>
-      <w:lvlJc w:val="left"/>
-    </w:lvl>
-    <w:lvl w:ilvl="5" w:tplc="B746A056">
-      <w:numFmt w:val="decimal"/>
-      <w:lvlText w:val=""/>
-      <w:lvlJc w:val="left"/>
-    </w:lvl>
-    <w:lvl w:ilvl="6" w:tplc="8FDA0B62">
-      <w:numFmt w:val="decimal"/>
-      <w:lvlText w:val=""/>
-      <w:lvlJc w:val="left"/>
-    </w:lvl>
-    <w:lvl w:ilvl="7" w:tplc="F2509EB4">
-      <w:numFmt w:val="decimal"/>
-      <w:lvlText w:val=""/>
-      <w:lvlJc w:val="left"/>
-    </w:lvl>
-    <w:lvl w:ilvl="8" w:tplc="09B6DF92">
+    <w:lvl w:ilvl="8" w:tplc="FD0EB1E2">
       <w:numFmt w:val="decimal"/>
       <w:lvlText w:val=""/>
       <w:lvlJc w:val="left"/>
     </w:lvl>
   </w:abstractNum>
   <w:abstractNum w:abstractNumId="2" w15:restartNumberingAfterBreak="0">
-    <w:nsid w:val="2A537397"/>
+    <w:nsid w:val="466A0A08"/>
     <w:multiLevelType w:val="hybridMultilevel"/>
-    <w:tmpl w:val="7B807BE2"/>
-    <w:lvl w:ilvl="0" w:tplc="22FC703C" w:tentative="1">
+    <w:tmpl w:val="29FAE4F2"/>
+    <w:lvl w:ilvl="0" w:tplc="9F4CA9F8">
       <w:start w:val="1"/>
-      <w:numFmt w:val="decimal"/>
-      <w:lvlText w:val="%1."/>
+      <w:numFmt w:val="bullet"/>
+      <w:lvlText w:val="•"/>
       <w:lvlJc w:val="left"/>
       <w:pPr>
-        <w:ind w:left="540" w:hanging="360"/>
+        <w:ind w:left="540" w:hanging="270"/>
       </w:pPr>
     </w:lvl>
-    <w:lvl w:ilvl="1" w:tplc="4EB288D0">
+    <w:lvl w:ilvl="1" w:tplc="1B1C4F3E" w:tentative="1">
+      <w:start w:val="1"/>
+      <w:numFmt w:val="bullet"/>
+      <w:lvlText w:val="–"/>
+      <w:lvlJc w:val="left"/>
+      <w:pPr>
+        <w:ind w:left="1000" w:hanging="270"/>
+      </w:pPr>
+    </w:lvl>
+    <w:lvl w:ilvl="2" w:tplc="7AD26C60">
       <w:numFmt w:val="decimal"/>
       <w:lvlText w:val=""/>
       <w:lvlJc w:val="left"/>
     </w:lvl>
-    <w:lvl w:ilvl="2" w:tplc="2FC87CA4">
+    <w:lvl w:ilvl="3" w:tplc="0032D580">
       <w:numFmt w:val="decimal"/>
       <w:lvlText w:val=""/>
       <w:lvlJc w:val="left"/>
     </w:lvl>
-    <w:lvl w:ilvl="3" w:tplc="4342C33E">
+    <w:lvl w:ilvl="4" w:tplc="4E78A65E">
       <w:numFmt w:val="decimal"/>
       <w:lvlText w:val=""/>
       <w:lvlJc w:val="left"/>
     </w:lvl>
-    <w:lvl w:ilvl="4" w:tplc="BD96CEB0">
+    <w:lvl w:ilvl="5" w:tplc="F1A287B8">
       <w:numFmt w:val="decimal"/>
       <w:lvlText w:val=""/>
       <w:lvlJc w:val="left"/>
     </w:lvl>
-    <w:lvl w:ilvl="5" w:tplc="C366D704">
+    <w:lvl w:ilvl="6" w:tplc="3F6C9E78">
       <w:numFmt w:val="decimal"/>
       <w:lvlText w:val=""/>
       <w:lvlJc w:val="left"/>
     </w:lvl>
-    <w:lvl w:ilvl="6" w:tplc="5E5AFAA2">
+    <w:lvl w:ilvl="7" w:tplc="CA24709C">
       <w:numFmt w:val="decimal"/>
       <w:lvlText w:val=""/>
       <w:lvlJc w:val="left"/>
     </w:lvl>
-    <w:lvl w:ilvl="7" w:tplc="D716247A">
-      <w:numFmt w:val="decimal"/>
-      <w:lvlText w:val=""/>
-      <w:lvlJc w:val="left"/>
-    </w:lvl>
-    <w:lvl w:ilvl="8" w:tplc="A3A47024">
+    <w:lvl w:ilvl="8" w:tplc="6E3C7818">
       <w:numFmt w:val="decimal"/>
       <w:lvlText w:val=""/>
       <w:lvlJc w:val="left"/>
     </w:lvl>
   </w:abstractNum>
   <w:abstractNum w:abstractNumId="3" w15:restartNumberingAfterBreak="0">
-    <w:nsid w:val="3E063E17"/>
+    <w:nsid w:val="54B43F34"/>
     <w:multiLevelType w:val="hybridMultilevel"/>
-    <w:tmpl w:val="74345474"/>
-    <w:lvl w:ilvl="0" w:tplc="492A30FE">
+    <w:tmpl w:val="CCAC9462"/>
+    <w:lvl w:ilvl="0" w:tplc="06C6381A">
       <w:start w:val="1"/>
       <w:numFmt w:val="decimal"/>
       <w:lvlText w:val="%1."/>
@@ -21840,52 +22857,52 @@
         <w:ind w:left="540" w:hanging="360"/>
       </w:pPr>
     </w:lvl>
-    <w:lvl w:ilvl="1" w:tplc="EA963D34">
+    <w:lvl w:ilvl="1" w:tplc="CE0297F4">
       <w:numFmt w:val="decimal"/>
       <w:lvlText w:val=""/>
       <w:lvlJc w:val="left"/>
     </w:lvl>
-    <w:lvl w:ilvl="2" w:tplc="706A2BF0">
+    <w:lvl w:ilvl="2" w:tplc="E63E8D90">
       <w:numFmt w:val="decimal"/>
       <w:lvlText w:val=""/>
       <w:lvlJc w:val="left"/>
     </w:lvl>
-    <w:lvl w:ilvl="3" w:tplc="DFF8D58C">
+    <w:lvl w:ilvl="3" w:tplc="4EA09F14">
       <w:numFmt w:val="decimal"/>
       <w:lvlText w:val=""/>
       <w:lvlJc w:val="left"/>
     </w:lvl>
-    <w:lvl w:ilvl="4" w:tplc="DF4C2AFE">
+    <w:lvl w:ilvl="4" w:tplc="63868998">
       <w:numFmt w:val="decimal"/>
       <w:lvlText w:val=""/>
       <w:lvlJc w:val="left"/>
     </w:lvl>
-    <w:lvl w:ilvl="5" w:tplc="9E3863CA">
+    <w:lvl w:ilvl="5" w:tplc="350EBAFA">
       <w:numFmt w:val="decimal"/>
       <w:lvlText w:val=""/>
       <w:lvlJc w:val="left"/>
     </w:lvl>
-    <w:lvl w:ilvl="6" w:tplc="BED2155E">
+    <w:lvl w:ilvl="6" w:tplc="C0087A1A">
       <w:numFmt w:val="decimal"/>
       <w:lvlText w:val=""/>
       <w:lvlJc w:val="left"/>
     </w:lvl>
-    <w:lvl w:ilvl="7" w:tplc="38825732">
+    <w:lvl w:ilvl="7" w:tplc="A650C4A0">
       <w:numFmt w:val="decimal"/>
       <w:lvlText w:val=""/>
       <w:lvlJc w:val="left"/>
     </w:lvl>
-    <w:lvl w:ilvl="8" w:tplc="69FC4FDC">
+    <w:lvl w:ilvl="8" w:tplc="D85003EA">
       <w:numFmt w:val="decimal"/>
       <w:lvlText w:val=""/>
       <w:lvlJc w:val="left"/>
     </w:lvl>
   </w:abstractNum>
   <w:abstractNum w:abstractNumId="4" w15:restartNumberingAfterBreak="0">
-    <w:nsid w:val="431A092F"/>
+    <w:nsid w:val="556A063C"/>
     <w:multiLevelType w:val="hybridMultilevel"/>
-    <w:tmpl w:val="09684E60"/>
-    <w:lvl w:ilvl="0" w:tplc="3E8CCB30">
+    <w:tmpl w:val="D924C50A"/>
+    <w:lvl w:ilvl="0" w:tplc="94C2571C">
       <w:start w:val="1"/>
       <w:numFmt w:val="decimal"/>
       <w:lvlText w:val="%1."/>
@@ -21894,138 +22911,52 @@
         <w:ind w:left="540" w:hanging="360"/>
       </w:pPr>
     </w:lvl>
-    <w:lvl w:ilvl="1" w:tplc="88000340">
+    <w:lvl w:ilvl="1" w:tplc="2392F5B8">
       <w:numFmt w:val="decimal"/>
       <w:lvlText w:val=""/>
       <w:lvlJc w:val="left"/>
     </w:lvl>
-    <w:lvl w:ilvl="2" w:tplc="17D21C16">
+    <w:lvl w:ilvl="2" w:tplc="269A659E">
       <w:numFmt w:val="decimal"/>
       <w:lvlText w:val=""/>
       <w:lvlJc w:val="left"/>
     </w:lvl>
-    <w:lvl w:ilvl="3" w:tplc="BE369F8A">
+    <w:lvl w:ilvl="3" w:tplc="E618C5E6">
       <w:numFmt w:val="decimal"/>
       <w:lvlText w:val=""/>
       <w:lvlJc w:val="left"/>
     </w:lvl>
-    <w:lvl w:ilvl="4" w:tplc="FCDE8A48">
+    <w:lvl w:ilvl="4" w:tplc="B7C8F692">
       <w:numFmt w:val="decimal"/>
       <w:lvlText w:val=""/>
       <w:lvlJc w:val="left"/>
     </w:lvl>
-    <w:lvl w:ilvl="5" w:tplc="53B0DB42">
+    <w:lvl w:ilvl="5" w:tplc="D9228388">
       <w:numFmt w:val="decimal"/>
       <w:lvlText w:val=""/>
       <w:lvlJc w:val="left"/>
     </w:lvl>
-    <w:lvl w:ilvl="6" w:tplc="33FC9100">
+    <w:lvl w:ilvl="6" w:tplc="9CCCDB22">
       <w:numFmt w:val="decimal"/>
       <w:lvlText w:val=""/>
       <w:lvlJc w:val="left"/>
     </w:lvl>
-    <w:lvl w:ilvl="7" w:tplc="338AA83A">
+    <w:lvl w:ilvl="7" w:tplc="4A84081C">
       <w:numFmt w:val="decimal"/>
       <w:lvlText w:val=""/>
       <w:lvlJc w:val="left"/>
     </w:lvl>
-    <w:lvl w:ilvl="8" w:tplc="63A045BC">
+    <w:lvl w:ilvl="8" w:tplc="7BCEFA10">
       <w:numFmt w:val="decimal"/>
       <w:lvlText w:val=""/>
       <w:lvlJc w:val="left"/>
     </w:lvl>
   </w:abstractNum>
   <w:abstractNum w:abstractNumId="5" w15:restartNumberingAfterBreak="0">
-    <w:nsid w:val="55667387"/>
+    <w:nsid w:val="69872546"/>
     <w:multiLevelType w:val="hybridMultilevel"/>
-    <w:tmpl w:val="F7484460"/>
-    <w:lvl w:ilvl="0" w:tplc="A67C4B74" w:tentative="1">
-      <w:start w:val="1"/>
-      <w:numFmt w:val="bullet"/>
-      <w:lvlText w:val="●"/>
-      <w:lvlJc w:val="left"/>
-      <w:pPr>
-        <w:ind w:left="720" w:hanging="360"/>
-      </w:pPr>
-    </w:lvl>
-    <w:lvl w:ilvl="1" w:tplc="375AF238" w:tentative="1">
-      <w:start w:val="1"/>
-      <w:numFmt w:val="bullet"/>
-      <w:lvlText w:val="○"/>
-      <w:lvlJc w:val="left"/>
-      <w:pPr>
-        <w:ind w:left="1440" w:hanging="360"/>
-      </w:pPr>
-    </w:lvl>
-    <w:lvl w:ilvl="2" w:tplc="DB12D93A" w:tentative="1">
-      <w:start w:val="1"/>
-      <w:numFmt w:val="bullet"/>
-      <w:lvlText w:val="■"/>
-      <w:lvlJc w:val="left"/>
-      <w:pPr>
-        <w:ind w:left="2160" w:hanging="360"/>
-      </w:pPr>
-    </w:lvl>
-    <w:lvl w:ilvl="3" w:tplc="358489EC" w:tentative="1">
-      <w:start w:val="1"/>
-      <w:numFmt w:val="bullet"/>
-      <w:lvlText w:val="●"/>
-      <w:lvlJc w:val="left"/>
-      <w:pPr>
-        <w:ind w:left="2880" w:hanging="360"/>
-      </w:pPr>
-    </w:lvl>
-    <w:lvl w:ilvl="4" w:tplc="93E0A70A" w:tentative="1">
-      <w:start w:val="1"/>
-      <w:numFmt w:val="bullet"/>
-      <w:lvlText w:val="○"/>
-      <w:lvlJc w:val="left"/>
-      <w:pPr>
-        <w:ind w:left="3600" w:hanging="360"/>
-      </w:pPr>
-    </w:lvl>
-    <w:lvl w:ilvl="5" w:tplc="94D415E6" w:tentative="1">
-      <w:start w:val="1"/>
-      <w:numFmt w:val="bullet"/>
-      <w:lvlText w:val="■"/>
-      <w:lvlJc w:val="left"/>
-      <w:pPr>
-        <w:ind w:left="4320" w:hanging="360"/>
-      </w:pPr>
-    </w:lvl>
-    <w:lvl w:ilvl="6" w:tplc="7C98672C" w:tentative="1">
-      <w:start w:val="1"/>
-      <w:numFmt w:val="bullet"/>
-      <w:lvlText w:val="●"/>
-      <w:lvlJc w:val="left"/>
-      <w:pPr>
-        <w:ind w:left="5040" w:hanging="360"/>
-      </w:pPr>
-    </w:lvl>
-    <w:lvl w:ilvl="7" w:tplc="9AD42922" w:tentative="1">
-      <w:start w:val="1"/>
-      <w:numFmt w:val="bullet"/>
-      <w:lvlText w:val="●"/>
-      <w:lvlJc w:val="left"/>
-      <w:pPr>
-        <w:ind w:left="5760" w:hanging="360"/>
-      </w:pPr>
-    </w:lvl>
-    <w:lvl w:ilvl="8" w:tplc="69F2DBB0" w:tentative="1">
-      <w:start w:val="1"/>
-      <w:numFmt w:val="bullet"/>
-      <w:lvlText w:val="●"/>
-      <w:lvlJc w:val="left"/>
-      <w:pPr>
-        <w:ind w:left="6480" w:hanging="360"/>
-      </w:pPr>
-    </w:lvl>
-  </w:abstractNum>
-  <w:abstractNum w:abstractNumId="6" w15:restartNumberingAfterBreak="0">
-    <w:nsid w:val="7BED151F"/>
-    <w:multiLevelType w:val="hybridMultilevel"/>
-    <w:tmpl w:val="0DF02E0A"/>
-    <w:lvl w:ilvl="0" w:tplc="B112B33A">
+    <w:tmpl w:val="627A5D98"/>
+    <w:lvl w:ilvl="0" w:tplc="E33281A0">
       <w:start w:val="1"/>
       <w:numFmt w:val="decimal"/>
       <w:lvlText w:val="%1."/>
@@ -22034,125 +22965,175 @@
         <w:ind w:left="540" w:hanging="360"/>
       </w:pPr>
     </w:lvl>
-    <w:lvl w:ilvl="1" w:tplc="2DCA08CE">
+    <w:lvl w:ilvl="1" w:tplc="3E6E9652">
       <w:numFmt w:val="decimal"/>
       <w:lvlText w:val=""/>
       <w:lvlJc w:val="left"/>
     </w:lvl>
-    <w:lvl w:ilvl="2" w:tplc="2F4282A0">
+    <w:lvl w:ilvl="2" w:tplc="57F267C0">
       <w:numFmt w:val="decimal"/>
       <w:lvlText w:val=""/>
       <w:lvlJc w:val="left"/>
     </w:lvl>
-    <w:lvl w:ilvl="3" w:tplc="CE2611A0">
+    <w:lvl w:ilvl="3" w:tplc="B002C382">
       <w:numFmt w:val="decimal"/>
       <w:lvlText w:val=""/>
       <w:lvlJc w:val="left"/>
     </w:lvl>
-    <w:lvl w:ilvl="4" w:tplc="96B87B02">
+    <w:lvl w:ilvl="4" w:tplc="DB003A0C">
       <w:numFmt w:val="decimal"/>
       <w:lvlText w:val=""/>
       <w:lvlJc w:val="left"/>
     </w:lvl>
-    <w:lvl w:ilvl="5" w:tplc="859C1386">
+    <w:lvl w:ilvl="5" w:tplc="4DF89448">
       <w:numFmt w:val="decimal"/>
       <w:lvlText w:val=""/>
       <w:lvlJc w:val="left"/>
     </w:lvl>
-    <w:lvl w:ilvl="6" w:tplc="82B4AA36">
+    <w:lvl w:ilvl="6" w:tplc="22C8A820">
       <w:numFmt w:val="decimal"/>
       <w:lvlText w:val=""/>
       <w:lvlJc w:val="left"/>
     </w:lvl>
-    <w:lvl w:ilvl="7" w:tplc="6012180C">
+    <w:lvl w:ilvl="7" w:tplc="4A2849D2">
       <w:numFmt w:val="decimal"/>
       <w:lvlText w:val=""/>
       <w:lvlJc w:val="left"/>
     </w:lvl>
-    <w:lvl w:ilvl="8" w:tplc="DE1C54D0">
+    <w:lvl w:ilvl="8" w:tplc="67662B1A">
+      <w:numFmt w:val="decimal"/>
+      <w:lvlText w:val=""/>
+      <w:lvlJc w:val="left"/>
+    </w:lvl>
+  </w:abstractNum>
+  <w:abstractNum w:abstractNumId="6" w15:restartNumberingAfterBreak="0">
+    <w:nsid w:val="6D5D5C49"/>
+    <w:multiLevelType w:val="hybridMultilevel"/>
+    <w:tmpl w:val="6406B370"/>
+    <w:lvl w:ilvl="0" w:tplc="649E9378">
+      <w:start w:val="1"/>
+      <w:numFmt w:val="decimal"/>
+      <w:lvlText w:val="%1."/>
+      <w:lvlJc w:val="left"/>
+      <w:pPr>
+        <w:ind w:left="540" w:hanging="360"/>
+      </w:pPr>
+    </w:lvl>
+    <w:lvl w:ilvl="1" w:tplc="DEB6A826">
+      <w:numFmt w:val="decimal"/>
+      <w:lvlText w:val=""/>
+      <w:lvlJc w:val="left"/>
+    </w:lvl>
+    <w:lvl w:ilvl="2" w:tplc="6170978C">
+      <w:numFmt w:val="decimal"/>
+      <w:lvlText w:val=""/>
+      <w:lvlJc w:val="left"/>
+    </w:lvl>
+    <w:lvl w:ilvl="3" w:tplc="763094CC">
+      <w:numFmt w:val="decimal"/>
+      <w:lvlText w:val=""/>
+      <w:lvlJc w:val="left"/>
+    </w:lvl>
+    <w:lvl w:ilvl="4" w:tplc="E9EA6B42">
+      <w:numFmt w:val="decimal"/>
+      <w:lvlText w:val=""/>
+      <w:lvlJc w:val="left"/>
+    </w:lvl>
+    <w:lvl w:ilvl="5" w:tplc="2C1232B4">
+      <w:numFmt w:val="decimal"/>
+      <w:lvlText w:val=""/>
+      <w:lvlJc w:val="left"/>
+    </w:lvl>
+    <w:lvl w:ilvl="6" w:tplc="6F6266BE">
+      <w:numFmt w:val="decimal"/>
+      <w:lvlText w:val=""/>
+      <w:lvlJc w:val="left"/>
+    </w:lvl>
+    <w:lvl w:ilvl="7" w:tplc="109CA5A2">
+      <w:numFmt w:val="decimal"/>
+      <w:lvlText w:val=""/>
+      <w:lvlJc w:val="left"/>
+    </w:lvl>
+    <w:lvl w:ilvl="8" w:tplc="A4A26922">
       <w:numFmt w:val="decimal"/>
       <w:lvlText w:val=""/>
       <w:lvlJc w:val="left"/>
     </w:lvl>
   </w:abstractNum>
   <w:abstractNum w:abstractNumId="7" w15:restartNumberingAfterBreak="0">
-    <w:nsid w:val="7E683CE5"/>
+    <w:nsid w:val="724175A0"/>
     <w:multiLevelType w:val="hybridMultilevel"/>
-    <w:tmpl w:val="DE5AC73A"/>
-    <w:lvl w:ilvl="0" w:tplc="B514710C">
+    <w:tmpl w:val="91A29D02"/>
+    <w:lvl w:ilvl="0" w:tplc="E98AEACA">
       <w:start w:val="1"/>
-      <w:numFmt w:val="bullet"/>
-      <w:lvlText w:val="•"/>
+      <w:numFmt w:val="decimal"/>
+      <w:lvlText w:val="%1."/>
       <w:lvlJc w:val="left"/>
       <w:pPr>
-        <w:ind w:left="540" w:hanging="270"/>
+        <w:ind w:left="540" w:hanging="360"/>
       </w:pPr>
     </w:lvl>
-    <w:lvl w:ilvl="1" w:tplc="61F8EFD6" w:tentative="1">
-      <w:start w:val="1"/>
-      <w:numFmt w:val="bullet"/>
-      <w:lvlText w:val="–"/>
-      <w:lvlJc w:val="left"/>
-      <w:pPr>
-        <w:ind w:left="1000" w:hanging="270"/>
-      </w:pPr>
-    </w:lvl>
-    <w:lvl w:ilvl="2" w:tplc="7C0EB8F8">
+    <w:lvl w:ilvl="1" w:tplc="DBCCB62E">
       <w:numFmt w:val="decimal"/>
       <w:lvlText w:val=""/>
       <w:lvlJc w:val="left"/>
     </w:lvl>
-    <w:lvl w:ilvl="3" w:tplc="A6F229BA">
+    <w:lvl w:ilvl="2" w:tplc="866426EC">
       <w:numFmt w:val="decimal"/>
       <w:lvlText w:val=""/>
       <w:lvlJc w:val="left"/>
     </w:lvl>
-    <w:lvl w:ilvl="4" w:tplc="1400B524">
+    <w:lvl w:ilvl="3" w:tplc="9334C5B2">
       <w:numFmt w:val="decimal"/>
       <w:lvlText w:val=""/>
       <w:lvlJc w:val="left"/>
     </w:lvl>
-    <w:lvl w:ilvl="5" w:tplc="A79460F4">
+    <w:lvl w:ilvl="4" w:tplc="E244007A">
       <w:numFmt w:val="decimal"/>
       <w:lvlText w:val=""/>
       <w:lvlJc w:val="left"/>
     </w:lvl>
-    <w:lvl w:ilvl="6" w:tplc="0B46DE24">
+    <w:lvl w:ilvl="5" w:tplc="A5C63D72">
       <w:numFmt w:val="decimal"/>
       <w:lvlText w:val=""/>
       <w:lvlJc w:val="left"/>
     </w:lvl>
-    <w:lvl w:ilvl="7" w:tplc="AC826274">
+    <w:lvl w:ilvl="6" w:tplc="91B66AD0">
       <w:numFmt w:val="decimal"/>
       <w:lvlText w:val=""/>
       <w:lvlJc w:val="left"/>
     </w:lvl>
-    <w:lvl w:ilvl="8" w:tplc="977AAB4C">
+    <w:lvl w:ilvl="7" w:tplc="245099C6">
+      <w:numFmt w:val="decimal"/>
+      <w:lvlText w:val=""/>
+      <w:lvlJc w:val="left"/>
+    </w:lvl>
+    <w:lvl w:ilvl="8" w:tplc="A860EA1A">
       <w:numFmt w:val="decimal"/>
       <w:lvlText w:val=""/>
       <w:lvlJc w:val="left"/>
     </w:lvl>
   </w:abstractNum>
-  <w:num w:numId="1" w16cid:durableId="1746566255">
-    <w:abstractNumId w:val="5"/>
+  <w:num w:numId="1" w16cid:durableId="566114333">
+    <w:abstractNumId w:val="0"/>
     <w:lvlOverride w:ilvl="0">
       <w:startOverride w:val="1"/>
     </w:lvlOverride>
   </w:num>
-  <w:num w:numId="2" w16cid:durableId="390428851">
+  <w:num w:numId="2" w16cid:durableId="1587182370">
     <w:abstractNumId w:val="3"/>
     <w:lvlOverride w:ilvl="0">
       <w:startOverride w:val="1"/>
     </w:lvlOverride>
   </w:num>
-  <w:num w:numId="3" w16cid:durableId="1159227231">
-    <w:abstractNumId w:val="6"/>
+  <w:num w:numId="3" w16cid:durableId="1782263200">
+    <w:abstractNumId w:val="7"/>
     <w:lvlOverride w:ilvl="0">
       <w:startOverride w:val="1"/>
     </w:lvlOverride>
   </w:num>
-  <w:num w:numId="4" w16cid:durableId="548031446">
-    <w:abstractNumId w:val="7"/>
+  <w:num w:numId="4" w16cid:durableId="435104634">
+    <w:abstractNumId w:val="2"/>
     <w:lvlOverride w:ilvl="0">
       <w:startOverride w:val="1"/>
     </w:lvlOverride>
@@ -22160,19 +23141,19 @@
       <w:startOverride w:val="1"/>
     </w:lvlOverride>
   </w:num>
-  <w:num w:numId="5" w16cid:durableId="128717285">
-    <w:abstractNumId w:val="0"/>
+  <w:num w:numId="5" w16cid:durableId="822357331">
+    <w:abstractNumId w:val="6"/>
     <w:lvlOverride w:ilvl="0">
       <w:startOverride w:val="1"/>
     </w:lvlOverride>
   </w:num>
-  <w:num w:numId="6" w16cid:durableId="1184782213">
-    <w:abstractNumId w:val="1"/>
+  <w:num w:numId="6" w16cid:durableId="1523932814">
+    <w:abstractNumId w:val="5"/>
     <w:lvlOverride w:ilvl="0">
       <w:startOverride w:val="1"/>
     </w:lvlOverride>
   </w:num>
-  <w:num w:numId="7" w16cid:durableId="1455489935">
+  <w:num w:numId="7" w16cid:durableId="2016104240">
     <w:abstractNumId w:val="4"/>
     <w:lvlOverride w:ilvl="0">
       <w:startOverride w:val="1"/>

</xml_diff>